<commit_message>
Livrables : maj Dossier de cadrage V4, renommage L3, maj L2
- L1 : mise à jour du Dossier de cadrage V4 (docx), retrait du PDF
- L2 : mise à jour du document Prototype & artefacts
- L3 : renommage du fichier de passation

Co-Authored-By: Claude Opus 4.8 <noreply@anthropic.com>
</commit_message>
<xml_diff>
--- a/livrables/L1-dossier-cadrage/Dossier de cadrage V4.docx
+++ b/livrables/L1-dossier-cadrage/Dossier de cadrage V4.docx
@@ -3365,32 +3365,52 @@
           <w:szCs w:val="22"/>
         </w:rPr>
       </w:pPr>
+      <w:proofErr w:type="spellStart"/>
       <w:r>
         <w:rPr>
           <w:rFonts w:ascii="Aptos" w:eastAsia="Aptos" w:hAnsi="Aptos" w:cs="Aptos"/>
           <w:sz w:val="22"/>
           <w:szCs w:val="22"/>
         </w:rPr>
-        <w:t>NeoTravel est une PME fondée en 2010, spécialisée dans le transport de personnes en groupe (particuliers, associations, collectivités, entreprises). Son modèle repose sur l’intermédiation : l’entreprise ne possède pas de flotte propre, mais orchestre la mise en relation entre les clients et un réseau d’autocaristes partenaires qualifiés. Sa valeur ajoutée réside dans sa capacité à comprendre un besoin, qualifier la demande, négocier les meilleures conditions et sécuriser la prestation.</w:t>
-      </w:r>
-    </w:p>
-    <w:p>
-      <w:pPr>
-        <w:spacing w:before="240" w:after="240"/>
-        <w:jc w:val="both"/>
+        <w:t>NeoTravel</w:t>
+      </w:r>
+      <w:proofErr w:type="spellEnd"/>
+      <w:r>
         <w:rPr>
           <w:rFonts w:ascii="Aptos" w:eastAsia="Aptos" w:hAnsi="Aptos" w:cs="Aptos"/>
           <w:sz w:val="22"/>
           <w:szCs w:val="22"/>
         </w:rPr>
-      </w:pPr>
-      <w:r>
+        <w:t xml:space="preserve"> est une PME fondée en 2010, spécialisée dans le transport de personnes en groupe (particuliers, associations, collectivités, entreprises). Son modèle repose sur l’intermédiation : l’entreprise ne possède pas de flotte propre, mais orchestre la mise en relation entre les clients et un réseau d’autocaristes partenaires qualifiés. Sa valeur ajoutée réside dans sa capacité à comprendre un besoin, qualifier la demande, négocier les meilleures conditions et sécuriser la prestation.</w:t>
+      </w:r>
+    </w:p>
+    <w:p>
+      <w:pPr>
+        <w:spacing w:before="240" w:after="240"/>
+        <w:jc w:val="both"/>
         <w:rPr>
           <w:rFonts w:ascii="Aptos" w:eastAsia="Aptos" w:hAnsi="Aptos" w:cs="Aptos"/>
           <w:sz w:val="22"/>
           <w:szCs w:val="22"/>
         </w:rPr>
-        <w:t>NeoTravel reçoit environ 60 leads par jour via son site et ses campagnes. L’acquisition n’est donc pas le problème : l’enjeu est la sous-exploitation du flux existant. Le traitement manuel crée un goulot d’étranglement structurel.</w:t>
+      </w:pPr>
+      <w:proofErr w:type="spellStart"/>
+      <w:r>
+        <w:rPr>
+          <w:rFonts w:ascii="Aptos" w:eastAsia="Aptos" w:hAnsi="Aptos" w:cs="Aptos"/>
+          <w:sz w:val="22"/>
+          <w:szCs w:val="22"/>
+        </w:rPr>
+        <w:t>NeoTravel</w:t>
+      </w:r>
+      <w:proofErr w:type="spellEnd"/>
+      <w:r>
+        <w:rPr>
+          <w:rFonts w:ascii="Aptos" w:eastAsia="Aptos" w:hAnsi="Aptos" w:cs="Aptos"/>
+          <w:sz w:val="22"/>
+          <w:szCs w:val="22"/>
+        </w:rPr>
+        <w:t xml:space="preserve"> reçoit environ 60 leads par jour via son site et ses campagnes. L’acquisition n’est donc pas le problème : l’enjeu est la sous-exploitation du flux existant. Le traitement manuel crée un goulot d’étranglement structurel.</w:t>
       </w:r>
     </w:p>
     <w:p>
@@ -3462,7 +3482,25 @@
           <w:sz w:val="22"/>
           <w:szCs w:val="22"/>
         </w:rPr>
-        <w:t xml:space="preserve"> Les commerciaux étant commissionnés, ils priorisent naturellement les demandes à fort potentiel. Des leads acquis via des campagnes payantes (Google Ads) sont donc peu ou pas recontactés, ce qui représente un manque à gagner direct et des investissements publicitaires gaspillés.</w:t>
+        <w:t xml:space="preserve"> Les commerciaux étant commissionnés, ils priorisent naturellement les demandes à fort potentiel. Des leads acquis via des campagnes payantes (Google </w:t>
+      </w:r>
+      <w:proofErr w:type="spellStart"/>
+      <w:r>
+        <w:rPr>
+          <w:rFonts w:ascii="Aptos" w:eastAsia="Aptos" w:hAnsi="Aptos" w:cs="Aptos"/>
+          <w:sz w:val="22"/>
+          <w:szCs w:val="22"/>
+        </w:rPr>
+        <w:t>Ads</w:t>
+      </w:r>
+      <w:proofErr w:type="spellEnd"/>
+      <w:r>
+        <w:rPr>
+          <w:rFonts w:ascii="Aptos" w:eastAsia="Aptos" w:hAnsi="Aptos" w:cs="Aptos"/>
+          <w:sz w:val="22"/>
+          <w:szCs w:val="22"/>
+        </w:rPr>
+        <w:t>) sont donc peu ou pas recontactés, ce qui représente un manque à gagner direct et des investissements publicitaires gaspillés.</w:t>
       </w:r>
     </w:p>
     <w:p>
@@ -3525,7 +3563,25 @@
           <w:sz w:val="22"/>
           <w:szCs w:val="22"/>
         </w:rPr>
-        <w:t xml:space="preserve"> NeoTravel limite volontairement ses campagnes : sans automatisation, plus de leads signifie surtout plus de pression opérationnelle, pas plus de chiffre d’affaires.</w:t>
+        <w:t xml:space="preserve"> </w:t>
+      </w:r>
+      <w:proofErr w:type="spellStart"/>
+      <w:r>
+        <w:rPr>
+          <w:rFonts w:ascii="Aptos" w:eastAsia="Aptos" w:hAnsi="Aptos" w:cs="Aptos"/>
+          <w:sz w:val="22"/>
+          <w:szCs w:val="22"/>
+        </w:rPr>
+        <w:t>NeoTravel</w:t>
+      </w:r>
+      <w:proofErr w:type="spellEnd"/>
+      <w:r>
+        <w:rPr>
+          <w:rFonts w:ascii="Aptos" w:eastAsia="Aptos" w:hAnsi="Aptos" w:cs="Aptos"/>
+          <w:sz w:val="22"/>
+          <w:szCs w:val="22"/>
+        </w:rPr>
+        <w:t xml:space="preserve"> limite volontairement ses campagnes : sans automatisation, plus de leads signifie surtout plus de pression opérationnelle, pas plus de chiffre d’affaires.</w:t>
       </w:r>
     </w:p>
     <w:p>
@@ -3545,7 +3601,15 @@
         <w:pStyle w:val="Normal1"/>
       </w:pPr>
       <w:r>
-        <w:t>Concevoir et livrer un prototype cohérent qui automatise l’ensemble du cycle commercial de NeoTravel, de la captation du lead jusqu’au Dashboard de pilotage, sans déshumaniser la relation client. L’automatisation prend en charge les tâches répétitives et fiabilise les processus ; l’humain reste au cœur des situations complexes.</w:t>
+        <w:t xml:space="preserve">Concevoir et livrer un prototype cohérent qui automatise l’ensemble du cycle commercial de </w:t>
+      </w:r>
+      <w:proofErr w:type="spellStart"/>
+      <w:r>
+        <w:t>NeoTravel</w:t>
+      </w:r>
+      <w:proofErr w:type="spellEnd"/>
+      <w:r>
+        <w:t>, de la captation du lead jusqu’au Dashboard de pilotage, sans déshumaniser la relation client. L’automatisation prend en charge les tâches répétitives et fiabilise les processus ; l’humain reste au cœur des situations complexes.</w:t>
       </w:r>
     </w:p>
     <w:p>
@@ -3882,6 +3946,7 @@
           <w:u w:val="none"/>
         </w:rPr>
       </w:pPr>
+      <w:proofErr w:type="spellStart"/>
       <w:r>
         <w:rPr>
           <w:color w:val="auto"/>
@@ -3889,7 +3954,37 @@
           <w:szCs w:val="22"/>
           <w:u w:val="none"/>
         </w:rPr>
-        <w:t>Reporting des indicateurs commerciaux (dashboard)</w:t>
+        <w:t>Reporting</w:t>
+      </w:r>
+      <w:proofErr w:type="spellEnd"/>
+      <w:r>
+        <w:rPr>
+          <w:color w:val="auto"/>
+          <w:sz w:val="22"/>
+          <w:szCs w:val="22"/>
+          <w:u w:val="none"/>
+        </w:rPr>
+        <w:t xml:space="preserve"> des indicateurs commerciaux (</w:t>
+      </w:r>
+      <w:proofErr w:type="spellStart"/>
+      <w:r>
+        <w:rPr>
+          <w:color w:val="auto"/>
+          <w:sz w:val="22"/>
+          <w:szCs w:val="22"/>
+          <w:u w:val="none"/>
+        </w:rPr>
+        <w:t>dashboard</w:t>
+      </w:r>
+      <w:proofErr w:type="spellEnd"/>
+      <w:r>
+        <w:rPr>
+          <w:color w:val="auto"/>
+          <w:sz w:val="22"/>
+          <w:szCs w:val="22"/>
+          <w:u w:val="none"/>
+        </w:rPr>
+        <w:t>)</w:t>
       </w:r>
     </w:p>
     <w:p>
@@ -3995,8 +4090,19 @@
           <w:szCs w:val="22"/>
           <w:u w:val="none"/>
         </w:rPr>
-        <w:t>Interface parfaitement designée</w:t>
-      </w:r>
+        <w:t xml:space="preserve">Interface parfaitement </w:t>
+      </w:r>
+      <w:proofErr w:type="spellStart"/>
+      <w:r>
+        <w:rPr>
+          <w:color w:val="auto"/>
+          <w:sz w:val="22"/>
+          <w:szCs w:val="22"/>
+          <w:u w:val="none"/>
+        </w:rPr>
+        <w:t>designée</w:t>
+      </w:r>
+      <w:proofErr w:type="spellEnd"/>
     </w:p>
     <w:p>
       <w:pPr>
@@ -4021,7 +4127,27 @@
           <w:szCs w:val="22"/>
           <w:u w:val="none"/>
         </w:rPr>
-        <w:t>CRM analytique complet (une vue/dashboard simple suffit)</w:t>
+        <w:t>CRM analytique complet (une vue/</w:t>
+      </w:r>
+      <w:proofErr w:type="spellStart"/>
+      <w:r>
+        <w:rPr>
+          <w:color w:val="auto"/>
+          <w:sz w:val="22"/>
+          <w:szCs w:val="22"/>
+          <w:u w:val="none"/>
+        </w:rPr>
+        <w:t>dashboard</w:t>
+      </w:r>
+      <w:proofErr w:type="spellEnd"/>
+      <w:r>
+        <w:rPr>
+          <w:color w:val="auto"/>
+          <w:sz w:val="22"/>
+          <w:szCs w:val="22"/>
+          <w:u w:val="none"/>
+        </w:rPr>
+        <w:t xml:space="preserve"> simple suffit)</w:t>
       </w:r>
     </w:p>
     <w:p>
@@ -8015,7 +8141,51 @@
                 <w:szCs w:val="22"/>
                 <w:lang w:eastAsia="fr-FR"/>
               </w:rPr>
-              <w:t>Moteur de devis déterministe calculer_devis()</w:t>
+              <w:t xml:space="preserve">Moteur de devis déterministe </w:t>
+            </w:r>
+            <w:proofErr w:type="spellStart"/>
+            <w:r>
+              <w:rPr>
+                <w:rFonts w:eastAsia="Arial" w:cs="Arial"/>
+                <w:color w:val="000000"/>
+                <w:sz w:val="22"/>
+                <w:szCs w:val="22"/>
+                <w:lang w:eastAsia="fr-FR"/>
+              </w:rPr>
+              <w:t>calculer_</w:t>
+            </w:r>
+            <w:proofErr w:type="gramStart"/>
+            <w:r>
+              <w:rPr>
+                <w:rFonts w:eastAsia="Arial" w:cs="Arial"/>
+                <w:color w:val="000000"/>
+                <w:sz w:val="22"/>
+                <w:szCs w:val="22"/>
+                <w:lang w:eastAsia="fr-FR"/>
+              </w:rPr>
+              <w:t>devis</w:t>
+            </w:r>
+            <w:proofErr w:type="spellEnd"/>
+            <w:r>
+              <w:rPr>
+                <w:rFonts w:eastAsia="Arial" w:cs="Arial"/>
+                <w:color w:val="000000"/>
+                <w:sz w:val="22"/>
+                <w:szCs w:val="22"/>
+                <w:lang w:eastAsia="fr-FR"/>
+              </w:rPr>
+              <w:t>(</w:t>
+            </w:r>
+            <w:proofErr w:type="gramEnd"/>
+            <w:r>
+              <w:rPr>
+                <w:rFonts w:eastAsia="Arial" w:cs="Arial"/>
+                <w:color w:val="000000"/>
+                <w:sz w:val="22"/>
+                <w:szCs w:val="22"/>
+                <w:lang w:eastAsia="fr-FR"/>
+              </w:rPr>
+              <w:t>)</w:t>
             </w:r>
           </w:p>
         </w:tc>
@@ -9270,11 +9440,19 @@
         </w:rPr>
       </w:pPr>
       <w:bookmarkStart w:id="9" w:name="_Toc233294557"/>
+      <w:proofErr w:type="spellStart"/>
       <w:r>
         <w:rPr>
           <w:lang w:val="en-US"/>
         </w:rPr>
-        <w:t>Cartographie As-Is / To-Be</w:t>
+        <w:t>Cartographie</w:t>
+      </w:r>
+      <w:proofErr w:type="spellEnd"/>
+      <w:r>
+        <w:rPr>
+          <w:lang w:val="en-US"/>
+        </w:rPr>
+        <w:t xml:space="preserve"> As-Is / To-Be</w:t>
       </w:r>
       <w:bookmarkEnd w:id="9"/>
     </w:p>
@@ -9308,7 +9486,27 @@
           <w:szCs w:val="22"/>
           <w:u w:val="none"/>
         </w:rPr>
-        <w:t>Notre objectif est de digitaliser sans déshumaniser, l’outil doit être un facilitateur de décision et permettra de gagner du temps sur les tâches répétitives. L’agent IA récolte les informations et prépare la décision, l’humain décide, négocie et engage NeoTravel. À chaque étape, l’humain garde la main.</w:t>
+        <w:t xml:space="preserve">Notre objectif est de digitaliser sans déshumaniser, l’outil doit être un facilitateur de décision et permettra de gagner du temps sur les tâches répétitives. L’agent IA récolte les informations et prépare la décision, l’humain décide, négocie et engage </w:t>
+      </w:r>
+      <w:proofErr w:type="spellStart"/>
+      <w:r>
+        <w:rPr>
+          <w:color w:val="auto"/>
+          <w:sz w:val="22"/>
+          <w:szCs w:val="22"/>
+          <w:u w:val="none"/>
+        </w:rPr>
+        <w:t>NeoTravel</w:t>
+      </w:r>
+      <w:proofErr w:type="spellEnd"/>
+      <w:r>
+        <w:rPr>
+          <w:color w:val="auto"/>
+          <w:sz w:val="22"/>
+          <w:szCs w:val="22"/>
+          <w:u w:val="none"/>
+        </w:rPr>
+        <w:t>. À chaque étape, l’humain garde la main.</w:t>
       </w:r>
     </w:p>
     <w:p>
@@ -9321,7 +9519,7 @@
           <w:noProof/>
         </w:rPr>
         <w:drawing>
-          <wp:inline distT="0" distB="0" distL="0" distR="0" wp14:anchorId="1F716C73" wp14:editId="65F4A661">
+          <wp:inline distT="0" distB="0" distL="0" distR="0" wp14:anchorId="1F716C73" wp14:editId="24B70B1F">
             <wp:extent cx="4076700" cy="3968704"/>
             <wp:effectExtent l="0" t="0" r="0" b="0"/>
             <wp:docPr id="1" name="Image 1">
@@ -9913,8 +10111,18 @@
                 <w:sz w:val="22"/>
                 <w:szCs w:val="22"/>
               </w:rPr>
-              <w:t>Pilotage du pipeline et des performances via le dashboard</w:t>
-            </w:r>
+              <w:t xml:space="preserve">Pilotage du pipeline et des performances via le </w:t>
+            </w:r>
+            <w:proofErr w:type="spellStart"/>
+            <w:r>
+              <w:rPr>
+                <w:color w:val="000000"/>
+                <w:sz w:val="22"/>
+                <w:szCs w:val="22"/>
+              </w:rPr>
+              <w:t>dashboard</w:t>
+            </w:r>
+            <w:proofErr w:type="spellEnd"/>
           </w:p>
         </w:tc>
       </w:tr>
@@ -10260,13 +10468,23 @@
                 <w:szCs w:val="22"/>
               </w:rPr>
             </w:pPr>
+            <w:proofErr w:type="spellStart"/>
             <w:r>
               <w:rPr>
                 <w:color w:val="000000"/>
                 <w:sz w:val="22"/>
                 <w:szCs w:val="22"/>
               </w:rPr>
-              <w:t>Multi-critères (distance, capacité, saison, urgence, options) — doit rester auditable</w:t>
+              <w:t>Multi-critères</w:t>
+            </w:r>
+            <w:proofErr w:type="spellEnd"/>
+            <w:r>
+              <w:rPr>
+                <w:color w:val="000000"/>
+                <w:sz w:val="22"/>
+                <w:szCs w:val="22"/>
+              </w:rPr>
+              <w:t xml:space="preserve"> (distance, capacité, saison, urgence, options) — doit rester auditable</w:t>
             </w:r>
           </w:p>
         </w:tc>
@@ -10514,7 +10732,25 @@
                 <w:sz w:val="22"/>
                 <w:szCs w:val="22"/>
               </w:rPr>
-              <w:t xml:space="preserve"> le 24/06, prototype le 29/06, soutenance le 01/07</w:t>
+              <w:t xml:space="preserve"> le 24/06, </w:t>
+            </w:r>
+            <w:proofErr w:type="gramStart"/>
+            <w:r>
+              <w:rPr>
+                <w:color w:val="000000"/>
+                <w:sz w:val="22"/>
+                <w:szCs w:val="22"/>
+              </w:rPr>
+              <w:t>prototype le</w:t>
+            </w:r>
+            <w:proofErr w:type="gramEnd"/>
+            <w:r>
+              <w:rPr>
+                <w:color w:val="000000"/>
+                <w:sz w:val="22"/>
+                <w:szCs w:val="22"/>
+              </w:rPr>
+              <w:t xml:space="preserve"> 29/06, soutenance le 01/07</w:t>
             </w:r>
           </w:p>
         </w:tc>
@@ -10597,7 +10833,15 @@
       </w:pPr>
       <w:bookmarkStart w:id="15" w:name="_Toc233103946"/>
       <w:r>
-        <w:t>La mise en œuvre du projet NeoTravel s’articule autour d’une trajectoire progressive divisée en trois phases clés, permettant de sécuriser les développements tout en garantissant la livraison d'un produit minimum viable (MVP) fonctionnel dès la première semaine.</w:t>
+        <w:t xml:space="preserve">La mise en œuvre du projet </w:t>
+      </w:r>
+      <w:proofErr w:type="spellStart"/>
+      <w:r>
+        <w:t>NeoTravel</w:t>
+      </w:r>
+      <w:proofErr w:type="spellEnd"/>
+      <w:r>
+        <w:t xml:space="preserve"> s’articule autour d’une trajectoire progressive divisée en trois phases clés, permettant de sécuriser les développements tout en garantissant la livraison d'un produit minimum viable (MVP) fonctionnel dès la première semaine.</w:t>
       </w:r>
     </w:p>
     <w:p>
@@ -10621,7 +10865,31 @@
         <w:pStyle w:val="Normal1"/>
       </w:pPr>
       <w:r>
-        <w:t>La première étape se concentre exclusivement sur l'établissement des fondations techniques et structurelles du projet. L'objectif est de mettre en place le socle de données relationnel sur Supabase (incluant la gestion des statuts commerciaux) et de concevoir le moteur de règles déterministe calculer_devis(). Entièrement testée en isolation, cette phase initiale constitue le cœur fonctionnel du MVP développé au cours de la semaine, assurant la fiabilité et la traçabilité des futurs calculs tarifaires sans aucune intervention de l'intelligence artificielle.</w:t>
+        <w:t xml:space="preserve">La première étape se concentre exclusivement sur l'établissement des fondations techniques et structurelles du projet. L'objectif est de mettre en place le socle de données relationnel sur </w:t>
+      </w:r>
+      <w:proofErr w:type="spellStart"/>
+      <w:r>
+        <w:t>Supabase</w:t>
+      </w:r>
+      <w:proofErr w:type="spellEnd"/>
+      <w:r>
+        <w:t xml:space="preserve"> (incluant la gestion des statuts commerciaux) et de concevoir le moteur de règles déterministe </w:t>
+      </w:r>
+      <w:proofErr w:type="spellStart"/>
+      <w:r>
+        <w:t>calculer_</w:t>
+      </w:r>
+      <w:proofErr w:type="gramStart"/>
+      <w:r>
+        <w:t>devis</w:t>
+      </w:r>
+      <w:proofErr w:type="spellEnd"/>
+      <w:r>
+        <w:t>(</w:t>
+      </w:r>
+      <w:proofErr w:type="gramEnd"/>
+      <w:r>
+        <w:t>). Entièrement testée en isolation, cette phase initiale constitue le cœur fonctionnel du MVP développé au cours de la semaine, assurant la fiabilité et la traçabilité des futurs calculs tarifaires sans aucune intervention de l'intelligence artificielle.</w:t>
       </w:r>
     </w:p>
     <w:p>
@@ -10645,7 +10913,23 @@
         <w:pStyle w:val="Normal1"/>
       </w:pPr>
       <w:r>
-        <w:t>Une fois les bases de données et de calcul solidifiées, la seconde phase vise à fluidifier le parcours opérationnel en automatisant les tâches à faible valeur ajoutée. Elle englobe la génération instantanée des devis au format PDF, l'envoi automatisé des propositions par email et la mise en œuvre de scénarios de relances programmées via l'orchestrateur n8n. C’est également durant cette phase qu'est déployé le tableau de bord (dashboard) de pilotage pour la direction, matérialisant ainsi une traversée applicative fine et complète de bout en bout au sein du MVP.</w:t>
+        <w:t xml:space="preserve">Une fois les bases de données et de calcul solidifiées, la seconde phase vise à fluidifier le parcours opérationnel en automatisant les tâches à faible valeur ajoutée. Elle englobe la génération instantanée des devis au format PDF, l'envoi automatisé des propositions par </w:t>
+      </w:r>
+      <w:proofErr w:type="gramStart"/>
+      <w:r>
+        <w:t>email</w:t>
+      </w:r>
+      <w:proofErr w:type="gramEnd"/>
+      <w:r>
+        <w:t xml:space="preserve"> et la mise en œuvre de scénarios de relances programmées via l'orchestrateur n8n. C’est également durant cette phase qu'est déployé le tableau de bord (</w:t>
+      </w:r>
+      <w:proofErr w:type="spellStart"/>
+      <w:r>
+        <w:t>dashboard</w:t>
+      </w:r>
+      <w:proofErr w:type="spellEnd"/>
+      <w:r>
+        <w:t>) de pilotage pour la direction, matérialisant ainsi une traversée applicative fine et complète de bout en bout au sein du MVP.</w:t>
       </w:r>
     </w:p>
     <w:p>
@@ -10669,7 +10953,23 @@
         <w:pStyle w:val="Normal1"/>
       </w:pPr>
       <w:r>
-        <w:t xml:space="preserve">La phase finale introduit la couche d'intelligence artificielle pour parfaire l'expérience client et optimiser la qualification des flux. Elle donne vie à l'agent conversationnel (chatbot) sur la landing page, capable de mener l'échange en langage naturel, d'extraire les paramètres requis et de détecter les informations manquantes. Cette phase intègre également la personnalisation contextuelle des relances et le système d'escalade humaine (Human-In-The-Loop) pour la prise en charge des cas complexes par un conseiller. L'ensemble de ce parcours </w:t>
+        <w:t>La phase finale introduit la couche d'intelligence artificielle pour parfaire l'expérience client et optimiser la qualification des flux. Elle donne vie à l'agent conversationnel (</w:t>
+      </w:r>
+      <w:proofErr w:type="spellStart"/>
+      <w:r>
+        <w:t>chatbot</w:t>
+      </w:r>
+      <w:proofErr w:type="spellEnd"/>
+      <w:r>
+        <w:t xml:space="preserve">) sur </w:t>
+      </w:r>
+      <w:proofErr w:type="gramStart"/>
+      <w:r>
+        <w:t>la landing</w:t>
+      </w:r>
+      <w:proofErr w:type="gramEnd"/>
+      <w:r>
+        <w:t xml:space="preserve"> page, capable de mener l'échange en langage naturel, d'extraire les paramètres requis et de détecter les informations manquantes. Cette phase intègre également la personnalisation contextuelle des relances et le système d'escalade humaine (Human-In-The-Loop) pour la prise en charge des cas complexes par un conseiller. L'ensemble de ce parcours </w:t>
       </w:r>
       <w:r>
         <w:t>sera</w:t>
@@ -10767,8 +11067,13 @@
       <w:r>
         <w:t xml:space="preserve">avec </w:t>
       </w:r>
-      <w:r>
-        <w:t>chatbot transmet la demande à un agent IA orchestré dans n8n. L’agent mène la conversation puis appelle des outils pour agir</w:t>
+      <w:proofErr w:type="spellStart"/>
+      <w:r>
+        <w:t>chatbot</w:t>
+      </w:r>
+      <w:proofErr w:type="spellEnd"/>
+      <w:r>
+        <w:t xml:space="preserve"> transmet la demande à un agent IA orchestré dans n8n. L’agent mène la conversation puis appelle des outils pour agir</w:t>
       </w:r>
       <w:r>
         <w:t xml:space="preserve">, </w:t>
@@ -10794,8 +11099,53 @@
         </w:rPr>
         <w:t xml:space="preserve">Socle de données : </w:t>
       </w:r>
-      <w:r>
-        <w:t>Supabase (PostgreSQL managé) avec Auth et Row Level Security. Le dashboard de pilotage est une page /admin de l’app Next.js qui lit Supabase (mise à jour temps réel via realtime). Relances et notifications via n8n (Schedule Trigger + email Resend).</w:t>
+      <w:proofErr w:type="spellStart"/>
+      <w:r>
+        <w:t>Supabase</w:t>
+      </w:r>
+      <w:proofErr w:type="spellEnd"/>
+      <w:r>
+        <w:t xml:space="preserve"> (PostgreSQL managé) avec Auth et Row Level Security. Le </w:t>
+      </w:r>
+      <w:proofErr w:type="spellStart"/>
+      <w:r>
+        <w:t>dashboard</w:t>
+      </w:r>
+      <w:proofErr w:type="spellEnd"/>
+      <w:r>
+        <w:t xml:space="preserve"> de pilotage est une page /admin de l’app Next.js qui lit </w:t>
+      </w:r>
+      <w:proofErr w:type="spellStart"/>
+      <w:r>
+        <w:t>Supabase</w:t>
+      </w:r>
+      <w:proofErr w:type="spellEnd"/>
+      <w:r>
+        <w:t xml:space="preserve"> (mise à jour temps réel via </w:t>
+      </w:r>
+      <w:proofErr w:type="spellStart"/>
+      <w:r>
+        <w:t>realtime</w:t>
+      </w:r>
+      <w:proofErr w:type="spellEnd"/>
+      <w:r>
+        <w:t xml:space="preserve">). Relances et notifications via n8n (Schedule Trigger + </w:t>
+      </w:r>
+      <w:proofErr w:type="gramStart"/>
+      <w:r>
+        <w:t>email</w:t>
+      </w:r>
+      <w:proofErr w:type="gramEnd"/>
+      <w:r>
+        <w:t xml:space="preserve"> </w:t>
+      </w:r>
+      <w:proofErr w:type="spellStart"/>
+      <w:r>
+        <w:t>Resend</w:t>
+      </w:r>
+      <w:proofErr w:type="spellEnd"/>
+      <w:r>
+        <w:t>).</w:t>
       </w:r>
     </w:p>
     <w:p>
@@ -10865,7 +11215,15 @@
       <w:bookmarkStart w:id="19" w:name="_Toc233294565"/>
       <w:r>
         <w:lastRenderedPageBreak/>
-        <w:t>Modèle de données (tables Supabase / PostgreSQ</w:t>
+        <w:t xml:space="preserve">Modèle de données (tables </w:t>
+      </w:r>
+      <w:proofErr w:type="spellStart"/>
+      <w:r>
+        <w:t>Supabase</w:t>
+      </w:r>
+      <w:proofErr w:type="spellEnd"/>
+      <w:r>
+        <w:t xml:space="preserve"> / PostgreSQ</w:t>
       </w:r>
       <w:r>
         <w:t>L</w:t>
@@ -10889,13 +11247,12 @@
         <w:rPr>
           <w:b/>
           <w:bCs/>
-          <w:noProof/>
         </w:rPr>
         <w:drawing>
-          <wp:inline distT="0" distB="0" distL="0" distR="0" wp14:anchorId="4C62ED73" wp14:editId="742308EC">
-            <wp:extent cx="6418053" cy="4278702"/>
-            <wp:effectExtent l="0" t="0" r="1905" b="7620"/>
-            <wp:docPr id="864114912" name="Image 7"/>
+          <wp:inline distT="0" distB="0" distL="0" distR="0" wp14:anchorId="55BBFA7D" wp14:editId="67543661">
+            <wp:extent cx="4927600" cy="3619663"/>
+            <wp:effectExtent l="0" t="0" r="6350" b="0"/>
+            <wp:docPr id="126322666" name="Image 1"/>
             <wp:cNvGraphicFramePr>
               <a:graphicFrameLocks xmlns:a="http://schemas.openxmlformats.org/drawingml/2006/main" noChangeAspect="1"/>
             </wp:cNvGraphicFramePr>
@@ -10903,17 +11260,11 @@
               <a:graphicData uri="http://schemas.openxmlformats.org/drawingml/2006/picture">
                 <pic:pic xmlns:pic="http://schemas.openxmlformats.org/drawingml/2006/picture">
                   <pic:nvPicPr>
-                    <pic:cNvPr id="864114912" name="Image 7"/>
+                    <pic:cNvPr id="126322666" name=""/>
                     <pic:cNvPicPr/>
                   </pic:nvPicPr>
                   <pic:blipFill>
-                    <a:blip r:embed="rId15" cstate="print">
-                      <a:extLst>
-                        <a:ext uri="{28A0092B-C50C-407E-A947-70E740481C1C}">
-                          <a14:useLocalDpi xmlns:a14="http://schemas.microsoft.com/office/drawing/2010/main" val="0"/>
-                        </a:ext>
-                      </a:extLst>
-                    </a:blip>
+                    <a:blip r:embed="rId15"/>
                     <a:stretch>
                       <a:fillRect/>
                     </a:stretch>
@@ -10921,7 +11272,7 @@
                   <pic:spPr>
                     <a:xfrm>
                       <a:off x="0" y="0"/>
-                      <a:ext cx="6448921" cy="4299280"/>
+                      <a:ext cx="4936392" cy="3626121"/>
                     </a:xfrm>
                     <a:prstGeom prst="rect">
                       <a:avLst/>
@@ -10964,10 +11315,23 @@
         <w:t>admins</w:t>
       </w:r>
       <w:r>
-        <w:t xml:space="preserve"> accèdent au pipeline complet. Authentification via Supabase Auth (</w:t>
-      </w:r>
-      <w:r>
-        <w:t>email + mot de passe</w:t>
+        <w:t xml:space="preserve"> accèdent au pipeline complet. Authentification via </w:t>
+      </w:r>
+      <w:proofErr w:type="spellStart"/>
+      <w:r>
+        <w:t>Supabase</w:t>
+      </w:r>
+      <w:proofErr w:type="spellEnd"/>
+      <w:r>
+        <w:t xml:space="preserve"> Auth (</w:t>
+      </w:r>
+      <w:proofErr w:type="gramStart"/>
+      <w:r>
+        <w:t>email</w:t>
+      </w:r>
+      <w:proofErr w:type="gramEnd"/>
+      <w:r>
+        <w:t xml:space="preserve"> + mot de passe</w:t>
       </w:r>
       <w:r>
         <w:t xml:space="preserve">) pour </w:t>
@@ -11073,7 +11437,6 @@
       </w:pPr>
       <w:bookmarkStart w:id="23" w:name="_Toc233294567"/>
       <w:r>
-        <w:lastRenderedPageBreak/>
         <w:t>Choix de stack &amp; modèle LLM</w:t>
       </w:r>
       <w:bookmarkEnd w:id="22"/>
@@ -11086,7 +11449,16 @@
       <w:bookmarkStart w:id="24" w:name="_Toc233103950"/>
       <w:bookmarkStart w:id="25" w:name="_Toc233294568"/>
       <w:r>
-        <w:t>Stack — Option A hybride (n8n + Supabase) retenue</w:t>
+        <w:lastRenderedPageBreak/>
+        <w:t xml:space="preserve">Stack — Option A hybride (n8n + </w:t>
+      </w:r>
+      <w:proofErr w:type="spellStart"/>
+      <w:r>
+        <w:t>Supabase</w:t>
+      </w:r>
+      <w:proofErr w:type="spellEnd"/>
+      <w:r>
+        <w:t>) retenue</w:t>
       </w:r>
       <w:bookmarkEnd w:id="24"/>
       <w:bookmarkEnd w:id="25"/>
@@ -11114,7 +11486,31 @@
         <w:t xml:space="preserve"> sur </w:t>
       </w:r>
       <w:r>
-        <w:t>: le nœud Code qui héberge calculer_devis() et l’app Next.js (front + dashboard).</w:t>
+        <w:t xml:space="preserve">: le nœud Code qui héberge </w:t>
+      </w:r>
+      <w:proofErr w:type="spellStart"/>
+      <w:r>
+        <w:t>calculer_</w:t>
+      </w:r>
+      <w:proofErr w:type="gramStart"/>
+      <w:r>
+        <w:t>devis</w:t>
+      </w:r>
+      <w:proofErr w:type="spellEnd"/>
+      <w:r>
+        <w:t>(</w:t>
+      </w:r>
+      <w:proofErr w:type="gramEnd"/>
+      <w:r>
+        <w:t xml:space="preserve">) et l’app Next.js (front + </w:t>
+      </w:r>
+      <w:proofErr w:type="spellStart"/>
+      <w:r>
+        <w:t>dashboard</w:t>
+      </w:r>
+      <w:proofErr w:type="spellEnd"/>
+      <w:r>
+        <w:t>).</w:t>
       </w:r>
     </w:p>
     <w:p>
@@ -11126,16 +11522,64 @@
           <w:b/>
           <w:bCs/>
         </w:rPr>
-        <w:t xml:space="preserve">Données sur Supabase (et non Airtable) : </w:t>
-      </w:r>
-      <w:r>
-        <w:t>comme une interface front est de toute façon nécessaire (landing + chat), Supabase apporte dans une seule stack la base relationnelle, l’authentification (admin + portail lead) et la sécurité par ligne (RLS)</w:t>
+        <w:t xml:space="preserve">Données sur </w:t>
+      </w:r>
+      <w:proofErr w:type="spellStart"/>
+      <w:r>
+        <w:rPr>
+          <w:b/>
+          <w:bCs/>
+        </w:rPr>
+        <w:t>Supabase</w:t>
+      </w:r>
+      <w:proofErr w:type="spellEnd"/>
+      <w:r>
+        <w:rPr>
+          <w:b/>
+          <w:bCs/>
+        </w:rPr>
+        <w:t xml:space="preserve"> (et non </w:t>
+      </w:r>
+      <w:proofErr w:type="spellStart"/>
+      <w:r>
+        <w:rPr>
+          <w:b/>
+          <w:bCs/>
+        </w:rPr>
+        <w:t>Airtable</w:t>
+      </w:r>
+      <w:proofErr w:type="spellEnd"/>
+      <w:r>
+        <w:rPr>
+          <w:b/>
+          <w:bCs/>
+        </w:rPr>
+        <w:t xml:space="preserve">) : </w:t>
+      </w:r>
+      <w:r>
+        <w:t xml:space="preserve">comme une interface front est de toute façon nécessaire (landing + chat), </w:t>
+      </w:r>
+      <w:proofErr w:type="spellStart"/>
+      <w:r>
+        <w:t>Supabase</w:t>
+      </w:r>
+      <w:proofErr w:type="spellEnd"/>
+      <w:r>
+        <w:t xml:space="preserve"> apporte dans une seule stack la base relationnelle, l’authentification (admin + portail lead) et la sécurité par ligne (RLS)</w:t>
       </w:r>
       <w:r>
         <w:t xml:space="preserve">, </w:t>
       </w:r>
       <w:r>
-        <w:t>le dashboard custom n’est alors plus un surcoût.</w:t>
+        <w:t xml:space="preserve">le </w:t>
+      </w:r>
+      <w:proofErr w:type="spellStart"/>
+      <w:r>
+        <w:t>dashboard</w:t>
+      </w:r>
+      <w:proofErr w:type="spellEnd"/>
+      <w:r>
+        <w:t xml:space="preserve"> custom n’est alors plus un surcoût.</w:t>
       </w:r>
     </w:p>
     <w:tbl>
@@ -11315,16 +11759,36 @@
                 <w:sz w:val="22"/>
                 <w:szCs w:val="22"/>
               </w:rPr>
-              <w:t>Next.js / React (</w:t>
-            </w:r>
+              <w:t xml:space="preserve">Next.js / </w:t>
+            </w:r>
+            <w:proofErr w:type="spellStart"/>
             <w:r>
               <w:rPr>
                 <w:color w:val="000000"/>
                 <w:sz w:val="22"/>
                 <w:szCs w:val="22"/>
               </w:rPr>
+              <w:t>React</w:t>
+            </w:r>
+            <w:proofErr w:type="spellEnd"/>
+            <w:r>
+              <w:rPr>
+                <w:color w:val="000000"/>
+                <w:sz w:val="22"/>
+                <w:szCs w:val="22"/>
+              </w:rPr>
+              <w:t xml:space="preserve"> (</w:t>
+            </w:r>
+            <w:proofErr w:type="spellStart"/>
+            <w:r>
+              <w:rPr>
+                <w:color w:val="000000"/>
+                <w:sz w:val="22"/>
+                <w:szCs w:val="22"/>
+              </w:rPr>
               <w:t>Netlify</w:t>
             </w:r>
+            <w:proofErr w:type="spellEnd"/>
             <w:r>
               <w:rPr>
                 <w:color w:val="000000"/>
@@ -11359,7 +11823,25 @@
                 <w:sz w:val="22"/>
                 <w:szCs w:val="22"/>
               </w:rPr>
-              <w:t>Hébergement gratuit, UI de chat branchée sur webhook n8n</w:t>
+              <w:t xml:space="preserve">Hébergement gratuit, UI de chat branchée sur </w:t>
+            </w:r>
+            <w:proofErr w:type="spellStart"/>
+            <w:r>
+              <w:rPr>
+                <w:color w:val="000000"/>
+                <w:sz w:val="22"/>
+                <w:szCs w:val="22"/>
+              </w:rPr>
+              <w:t>webhook</w:t>
+            </w:r>
+            <w:proofErr w:type="spellEnd"/>
+            <w:r>
+              <w:rPr>
+                <w:color w:val="000000"/>
+                <w:sz w:val="22"/>
+                <w:szCs w:val="22"/>
+              </w:rPr>
+              <w:t xml:space="preserve"> n8n</w:t>
             </w:r>
           </w:p>
         </w:tc>
@@ -11414,13 +11896,23 @@
                 <w:szCs w:val="22"/>
               </w:rPr>
             </w:pPr>
+            <w:proofErr w:type="gramStart"/>
             <w:r>
               <w:rPr>
                 <w:color w:val="000000"/>
                 <w:sz w:val="22"/>
                 <w:szCs w:val="22"/>
               </w:rPr>
-              <w:t>n8n — nœud AI Agent</w:t>
+              <w:t>n</w:t>
+            </w:r>
+            <w:proofErr w:type="gramEnd"/>
+            <w:r>
+              <w:rPr>
+                <w:color w:val="000000"/>
+                <w:sz w:val="22"/>
+                <w:szCs w:val="22"/>
+              </w:rPr>
+              <w:t>8n — nœud AI Agent</w:t>
             </w:r>
           </w:p>
         </w:tc>
@@ -11592,13 +12084,23 @@
                 <w:szCs w:val="22"/>
               </w:rPr>
             </w:pPr>
+            <w:proofErr w:type="spellStart"/>
             <w:r>
               <w:rPr>
                 <w:color w:val="000000"/>
                 <w:sz w:val="22"/>
                 <w:szCs w:val="22"/>
               </w:rPr>
-              <w:t>Supabase (PostgreSQL)</w:t>
+              <w:t>Supabase</w:t>
+            </w:r>
+            <w:proofErr w:type="spellEnd"/>
+            <w:r>
+              <w:rPr>
+                <w:color w:val="000000"/>
+                <w:sz w:val="22"/>
+                <w:szCs w:val="22"/>
+              </w:rPr>
+              <w:t xml:space="preserve"> (PostgreSQL)</w:t>
             </w:r>
           </w:p>
         </w:tc>
@@ -11681,13 +12183,23 @@
                 <w:szCs w:val="22"/>
               </w:rPr>
             </w:pPr>
+            <w:proofErr w:type="spellStart"/>
             <w:r>
               <w:rPr>
                 <w:color w:val="000000"/>
                 <w:sz w:val="22"/>
                 <w:szCs w:val="22"/>
               </w:rPr>
-              <w:t>Supabase Auth + RLS</w:t>
+              <w:t>Supabase</w:t>
+            </w:r>
+            <w:proofErr w:type="spellEnd"/>
+            <w:r>
+              <w:rPr>
+                <w:color w:val="000000"/>
+                <w:sz w:val="22"/>
+                <w:szCs w:val="22"/>
+              </w:rPr>
+              <w:t xml:space="preserve"> Auth + RLS</w:t>
             </w:r>
           </w:p>
         </w:tc>
@@ -11748,8 +12260,18 @@
                 <w:sz w:val="22"/>
                 <w:szCs w:val="22"/>
               </w:rPr>
-              <w:t>Relances / emails</w:t>
-            </w:r>
+              <w:t xml:space="preserve">Relances / </w:t>
+            </w:r>
+            <w:proofErr w:type="gramStart"/>
+            <w:r>
+              <w:rPr>
+                <w:color w:val="000000"/>
+                <w:sz w:val="22"/>
+                <w:szCs w:val="22"/>
+              </w:rPr>
+              <w:t>emails</w:t>
+            </w:r>
+            <w:proofErr w:type="gramEnd"/>
           </w:p>
         </w:tc>
         <w:tc>
@@ -11770,14 +12292,34 @@
                 <w:szCs w:val="22"/>
               </w:rPr>
             </w:pPr>
+            <w:proofErr w:type="gramStart"/>
             <w:r>
               <w:rPr>
                 <w:color w:val="000000"/>
                 <w:sz w:val="22"/>
                 <w:szCs w:val="22"/>
               </w:rPr>
-              <w:t>n8n Schedule + Resend</w:t>
-            </w:r>
+              <w:t>n</w:t>
+            </w:r>
+            <w:proofErr w:type="gramEnd"/>
+            <w:r>
+              <w:rPr>
+                <w:color w:val="000000"/>
+                <w:sz w:val="22"/>
+                <w:szCs w:val="22"/>
+              </w:rPr>
+              <w:t xml:space="preserve">8n Schedule + </w:t>
+            </w:r>
+            <w:proofErr w:type="spellStart"/>
+            <w:r>
+              <w:rPr>
+                <w:color w:val="000000"/>
+                <w:sz w:val="22"/>
+                <w:szCs w:val="22"/>
+              </w:rPr>
+              <w:t>Resend</w:t>
+            </w:r>
+            <w:proofErr w:type="spellEnd"/>
           </w:p>
         </w:tc>
         <w:tc>
@@ -11804,7 +12346,25 @@
                 <w:sz w:val="22"/>
                 <w:szCs w:val="22"/>
               </w:rPr>
-              <w:t>Planification simple, envoi d’emails de test</w:t>
+              <w:t xml:space="preserve">Planification simple, envoi </w:t>
+            </w:r>
+            <w:proofErr w:type="gramStart"/>
+            <w:r>
+              <w:rPr>
+                <w:color w:val="000000"/>
+                <w:sz w:val="22"/>
+                <w:szCs w:val="22"/>
+              </w:rPr>
+              <w:t>d’emails</w:t>
+            </w:r>
+            <w:proofErr w:type="gramEnd"/>
+            <w:r>
+              <w:rPr>
+                <w:color w:val="000000"/>
+                <w:sz w:val="22"/>
+                <w:szCs w:val="22"/>
+              </w:rPr>
+              <w:t xml:space="preserve"> de test</w:t>
             </w:r>
           </w:p>
         </w:tc>
@@ -11865,7 +12425,43 @@
                 <w:sz w:val="22"/>
                 <w:szCs w:val="22"/>
               </w:rPr>
-              <w:t>Page /admin (React → Supabase)</w:t>
+              <w:t>Page /admin (</w:t>
+            </w:r>
+            <w:proofErr w:type="spellStart"/>
+            <w:r>
+              <w:rPr>
+                <w:color w:val="000000"/>
+                <w:sz w:val="22"/>
+                <w:szCs w:val="22"/>
+              </w:rPr>
+              <w:t>React</w:t>
+            </w:r>
+            <w:proofErr w:type="spellEnd"/>
+            <w:r>
+              <w:rPr>
+                <w:color w:val="000000"/>
+                <w:sz w:val="22"/>
+                <w:szCs w:val="22"/>
+              </w:rPr>
+              <w:t xml:space="preserve"> → </w:t>
+            </w:r>
+            <w:proofErr w:type="spellStart"/>
+            <w:r>
+              <w:rPr>
+                <w:color w:val="000000"/>
+                <w:sz w:val="22"/>
+                <w:szCs w:val="22"/>
+              </w:rPr>
+              <w:t>Supabase</w:t>
+            </w:r>
+            <w:proofErr w:type="spellEnd"/>
+            <w:r>
+              <w:rPr>
+                <w:color w:val="000000"/>
+                <w:sz w:val="22"/>
+                <w:szCs w:val="22"/>
+              </w:rPr>
+              <w:t>)</w:t>
             </w:r>
           </w:p>
         </w:tc>
@@ -12121,7 +12717,6 @@
                 <w:sz w:val="22"/>
                 <w:szCs w:val="22"/>
               </w:rPr>
-              <w:lastRenderedPageBreak/>
               <w:t>Sorties structurées</w:t>
             </w:r>
           </w:p>
@@ -12149,7 +12744,71 @@
                 <w:sz w:val="22"/>
                 <w:szCs w:val="22"/>
               </w:rPr>
-              <w:t>Pas de function calling ni de JSON Schema strict natif (modèle ouvert). Le JSON est obtenu par prompt, puis nettoyé et validé côté code avant calculer_devis()</w:t>
+              <w:t xml:space="preserve">Pas de </w:t>
+            </w:r>
+            <w:proofErr w:type="spellStart"/>
+            <w:r>
+              <w:rPr>
+                <w:sz w:val="22"/>
+                <w:szCs w:val="22"/>
+              </w:rPr>
+              <w:t>function</w:t>
+            </w:r>
+            <w:proofErr w:type="spellEnd"/>
+            <w:r>
+              <w:rPr>
+                <w:sz w:val="22"/>
+                <w:szCs w:val="22"/>
+              </w:rPr>
+              <w:t xml:space="preserve"> </w:t>
+            </w:r>
+            <w:proofErr w:type="spellStart"/>
+            <w:r>
+              <w:rPr>
+                <w:sz w:val="22"/>
+                <w:szCs w:val="22"/>
+              </w:rPr>
+              <w:t>calling</w:t>
+            </w:r>
+            <w:proofErr w:type="spellEnd"/>
+            <w:r>
+              <w:rPr>
+                <w:sz w:val="22"/>
+                <w:szCs w:val="22"/>
+              </w:rPr>
+              <w:t xml:space="preserve"> ni de JSON Schema strict natif (modèle ouvert). Le JSON est obtenu par prompt, puis nettoyé et validé côté code avant </w:t>
+            </w:r>
+            <w:proofErr w:type="spellStart"/>
+            <w:r>
+              <w:rPr>
+                <w:sz w:val="22"/>
+                <w:szCs w:val="22"/>
+              </w:rPr>
+              <w:t>calculer_</w:t>
+            </w:r>
+            <w:proofErr w:type="gramStart"/>
+            <w:r>
+              <w:rPr>
+                <w:sz w:val="22"/>
+                <w:szCs w:val="22"/>
+              </w:rPr>
+              <w:t>devis</w:t>
+            </w:r>
+            <w:proofErr w:type="spellEnd"/>
+            <w:r>
+              <w:rPr>
+                <w:sz w:val="22"/>
+                <w:szCs w:val="22"/>
+              </w:rPr>
+              <w:t>(</w:t>
+            </w:r>
+            <w:proofErr w:type="gramEnd"/>
+            <w:r>
+              <w:rPr>
+                <w:sz w:val="22"/>
+                <w:szCs w:val="22"/>
+              </w:rPr>
+              <w:t>)</w:t>
             </w:r>
           </w:p>
         </w:tc>
@@ -12179,6 +12838,7 @@
                 <w:sz w:val="22"/>
                 <w:szCs w:val="22"/>
               </w:rPr>
+              <w:lastRenderedPageBreak/>
               <w:t>Latence</w:t>
             </w:r>
           </w:p>
@@ -12339,14 +12999,24 @@
                 <w:sz w:val="22"/>
                 <w:szCs w:val="22"/>
               </w:rPr>
-              <w:t>Largement suffisant pour qualifier et extraire. Limites observées en test : pas de tool-calling</w:t>
-            </w:r>
+              <w:t xml:space="preserve">Largement suffisant pour qualifier et extraire. Limites observées en test : pas de </w:t>
+            </w:r>
+            <w:proofErr w:type="spellStart"/>
             <w:r>
               <w:rPr>
                 <w:color w:val="000000"/>
                 <w:sz w:val="22"/>
                 <w:szCs w:val="22"/>
               </w:rPr>
+              <w:t>tool-calling</w:t>
+            </w:r>
+            <w:proofErr w:type="spellEnd"/>
+            <w:r>
+              <w:rPr>
+                <w:color w:val="000000"/>
+                <w:sz w:val="22"/>
+                <w:szCs w:val="22"/>
+              </w:rPr>
               <w:t xml:space="preserve"> : </w:t>
             </w:r>
             <w:r>
@@ -12355,7 +13025,25 @@
                 <w:sz w:val="22"/>
                 <w:szCs w:val="22"/>
               </w:rPr>
-              <w:t>extraction faite dans un nœud séparé ; quelques erreurs serveur 500 transitoires (gérées par auto-retry)</w:t>
+              <w:t>extraction faite dans un nœud séparé ; quelques erreurs serveur 500 transitoires (gérées par auto-</w:t>
+            </w:r>
+            <w:proofErr w:type="spellStart"/>
+            <w:r>
+              <w:rPr>
+                <w:color w:val="000000"/>
+                <w:sz w:val="22"/>
+                <w:szCs w:val="22"/>
+              </w:rPr>
+              <w:t>retry</w:t>
+            </w:r>
+            <w:proofErr w:type="spellEnd"/>
+            <w:r>
+              <w:rPr>
+                <w:color w:val="000000"/>
+                <w:sz w:val="22"/>
+                <w:szCs w:val="22"/>
+              </w:rPr>
+              <w:t>)</w:t>
             </w:r>
             <w:r>
               <w:rPr>
@@ -12390,7 +13078,15 @@
         <w:t>Pourquoi ce choix :</w:t>
       </w:r>
       <w:r>
-        <w:t xml:space="preserve"> la contrainte budgétaire a orienté vers Gemma 4 via Google AI Studio, gratuit et suffisant pour le rôle d'assistance. Le pricing restant 100 % déterministe (code), un modèle modeste convient parfaitement.</w:t>
+        <w:t xml:space="preserve"> la contrainte budgétaire a orienté vers Gemma 4 via Google AI Studio, gratuit et suffisant pour le rôle d'assistance. Le </w:t>
+      </w:r>
+      <w:proofErr w:type="spellStart"/>
+      <w:r>
+        <w:t>pricing</w:t>
+      </w:r>
+      <w:proofErr w:type="spellEnd"/>
+      <w:r>
+        <w:t xml:space="preserve"> restant 100 % déterministe (code), un modèle modeste convient parfaitement.</w:t>
       </w:r>
     </w:p>
     <w:p>
@@ -12800,7 +13496,6 @@
                 <w:sz w:val="22"/>
                 <w:szCs w:val="22"/>
               </w:rPr>
-              <w:lastRenderedPageBreak/>
               <w:t>4. Devis sans réponse</w:t>
             </w:r>
           </w:p>
@@ -12862,6 +13557,7 @@
                 <w:sz w:val="22"/>
                 <w:szCs w:val="22"/>
               </w:rPr>
+              <w:lastRenderedPageBreak/>
               <w:t>5. Devis accepté</w:t>
             </w:r>
           </w:p>
@@ -12967,7 +13663,25 @@
                 <w:sz w:val="22"/>
                 <w:szCs w:val="22"/>
               </w:rPr>
-              <w:t>Statut mis à jour, email de courtoisie, traçabilité conservée</w:t>
+              <w:t xml:space="preserve">Statut mis à jour, </w:t>
+            </w:r>
+            <w:proofErr w:type="gramStart"/>
+            <w:r>
+              <w:rPr>
+                <w:color w:val="000000"/>
+                <w:sz w:val="22"/>
+                <w:szCs w:val="22"/>
+              </w:rPr>
+              <w:t>email</w:t>
+            </w:r>
+            <w:proofErr w:type="gramEnd"/>
+            <w:r>
+              <w:rPr>
+                <w:color w:val="000000"/>
+                <w:sz w:val="22"/>
+                <w:szCs w:val="22"/>
+              </w:rPr>
+              <w:t xml:space="preserve"> de courtoisie, traçabilité conservée</w:t>
             </w:r>
           </w:p>
         </w:tc>
@@ -13213,7 +13927,43 @@
                 <w:sz w:val="22"/>
                 <w:szCs w:val="22"/>
               </w:rPr>
-              <w:t>Réponses ancrées sur la base (lookup) ; « no sources, no answer »</w:t>
+              <w:t>Réponses ancrées sur la base (</w:t>
+            </w:r>
+            <w:proofErr w:type="spellStart"/>
+            <w:r>
+              <w:rPr>
+                <w:color w:val="000000"/>
+                <w:sz w:val="22"/>
+                <w:szCs w:val="22"/>
+              </w:rPr>
+              <w:t>lookup</w:t>
+            </w:r>
+            <w:proofErr w:type="spellEnd"/>
+            <w:r>
+              <w:rPr>
+                <w:color w:val="000000"/>
+                <w:sz w:val="22"/>
+                <w:szCs w:val="22"/>
+              </w:rPr>
+              <w:t xml:space="preserve">) ; « no sources, no </w:t>
+            </w:r>
+            <w:proofErr w:type="spellStart"/>
+            <w:r>
+              <w:rPr>
+                <w:color w:val="000000"/>
+                <w:sz w:val="22"/>
+                <w:szCs w:val="22"/>
+              </w:rPr>
+              <w:t>answer</w:t>
+            </w:r>
+            <w:proofErr w:type="spellEnd"/>
+            <w:r>
+              <w:rPr>
+                <w:color w:val="000000"/>
+                <w:sz w:val="22"/>
+                <w:szCs w:val="22"/>
+              </w:rPr>
+              <w:t xml:space="preserve"> »</w:t>
             </w:r>
           </w:p>
         </w:tc>
@@ -13874,17 +14624,7 @@
                 <w:szCs w:val="22"/>
                 <w:lang w:eastAsia="fr-FR"/>
               </w:rPr>
-              <w:t xml:space="preserve">Temps écoulé entre la soumission d'une demande complète et </w:t>
-            </w:r>
-            <w:r>
-              <w:rPr>
-                <w:rFonts w:eastAsia="Arial" w:cs="Arial"/>
-                <w:sz w:val="22"/>
-                <w:szCs w:val="22"/>
-                <w:lang w:eastAsia="fr-FR"/>
-              </w:rPr>
-              <w:lastRenderedPageBreak/>
-              <w:t>l'envoi du devis PDF au prospect</w:t>
+              <w:t>Temps écoulé entre la soumission d'une demande complète et l'envoi du devis PDF au prospect</w:t>
             </w:r>
           </w:p>
         </w:tc>
@@ -13909,8 +14649,67 @@
                 <w:szCs w:val="22"/>
                 <w:lang w:eastAsia="fr-FR"/>
               </w:rPr>
-              <w:lastRenderedPageBreak/>
-              <w:t>Horodatage Supabase : created_at demande → sent_at devis</w:t>
+              <w:t xml:space="preserve">Horodatage </w:t>
+            </w:r>
+            <w:proofErr w:type="spellStart"/>
+            <w:r>
+              <w:rPr>
+                <w:rFonts w:eastAsia="Arial" w:cs="Arial"/>
+                <w:sz w:val="22"/>
+                <w:szCs w:val="22"/>
+                <w:lang w:eastAsia="fr-FR"/>
+              </w:rPr>
+              <w:t>Supabase</w:t>
+            </w:r>
+            <w:proofErr w:type="spellEnd"/>
+            <w:r>
+              <w:rPr>
+                <w:rFonts w:eastAsia="Arial" w:cs="Arial"/>
+                <w:sz w:val="22"/>
+                <w:szCs w:val="22"/>
+                <w:lang w:eastAsia="fr-FR"/>
+              </w:rPr>
+              <w:t xml:space="preserve"> : </w:t>
+            </w:r>
+            <w:proofErr w:type="spellStart"/>
+            <w:r>
+              <w:rPr>
+                <w:rFonts w:eastAsia="Arial" w:cs="Arial"/>
+                <w:sz w:val="22"/>
+                <w:szCs w:val="22"/>
+                <w:lang w:eastAsia="fr-FR"/>
+              </w:rPr>
+              <w:t>created_at</w:t>
+            </w:r>
+            <w:proofErr w:type="spellEnd"/>
+            <w:r>
+              <w:rPr>
+                <w:rFonts w:eastAsia="Arial" w:cs="Arial"/>
+                <w:sz w:val="22"/>
+                <w:szCs w:val="22"/>
+                <w:lang w:eastAsia="fr-FR"/>
+              </w:rPr>
+              <w:t xml:space="preserve"> demande → </w:t>
+            </w:r>
+            <w:proofErr w:type="spellStart"/>
+            <w:r>
+              <w:rPr>
+                <w:rFonts w:eastAsia="Arial" w:cs="Arial"/>
+                <w:sz w:val="22"/>
+                <w:szCs w:val="22"/>
+                <w:lang w:eastAsia="fr-FR"/>
+              </w:rPr>
+              <w:t>sent_at</w:t>
+            </w:r>
+            <w:proofErr w:type="spellEnd"/>
+            <w:r>
+              <w:rPr>
+                <w:rFonts w:eastAsia="Arial" w:cs="Arial"/>
+                <w:sz w:val="22"/>
+                <w:szCs w:val="22"/>
+                <w:lang w:eastAsia="fr-FR"/>
+              </w:rPr>
+              <w:t xml:space="preserve"> devis</w:t>
             </w:r>
           </w:p>
         </w:tc>
@@ -13935,17 +14734,7 @@
                 <w:szCs w:val="22"/>
                 <w:lang w:eastAsia="fr-FR"/>
               </w:rPr>
-              <w:t xml:space="preserve">≤ 3 minutes pour une demande qualifiée </w:t>
-            </w:r>
-            <w:r>
-              <w:rPr>
-                <w:rFonts w:eastAsia="Arial" w:cs="Arial"/>
-                <w:sz w:val="22"/>
-                <w:szCs w:val="22"/>
-                <w:lang w:eastAsia="fr-FR"/>
-              </w:rPr>
-              <w:lastRenderedPageBreak/>
-              <w:t>complète (vs 24-48 h en manuel)</w:t>
+              <w:t>≤ 3 minutes pour une demande qualifiée complète (vs 24-48 h en manuel)</w:t>
             </w:r>
           </w:p>
         </w:tc>
@@ -13970,7 +14759,6 @@
                 <w:szCs w:val="22"/>
                 <w:lang w:eastAsia="fr-FR"/>
               </w:rPr>
-              <w:lastRenderedPageBreak/>
               <w:t>Dès la mise en production du prototype</w:t>
             </w:r>
           </w:p>
@@ -14002,6 +14790,7 @@
                 <w:szCs w:val="22"/>
                 <w:lang w:eastAsia="fr-FR"/>
               </w:rPr>
+              <w:lastRenderedPageBreak/>
               <w:t>Taux de conversion devis → accepté</w:t>
             </w:r>
           </w:p>
@@ -14077,7 +14866,27 @@
                 <w:szCs w:val="22"/>
                 <w:lang w:eastAsia="fr-FR"/>
               </w:rPr>
-              <w:t>≥ 25 % (baseline à établir sur les 30 premiers jours)</w:t>
+              <w:t>≥ 25 % (</w:t>
+            </w:r>
+            <w:proofErr w:type="spellStart"/>
+            <w:r>
+              <w:rPr>
+                <w:rFonts w:eastAsia="Arial" w:cs="Arial"/>
+                <w:sz w:val="22"/>
+                <w:szCs w:val="22"/>
+                <w:lang w:eastAsia="fr-FR"/>
+              </w:rPr>
+              <w:t>baseline</w:t>
+            </w:r>
+            <w:proofErr w:type="spellEnd"/>
+            <w:r>
+              <w:rPr>
+                <w:rFonts w:eastAsia="Arial" w:cs="Arial"/>
+                <w:sz w:val="22"/>
+                <w:szCs w:val="22"/>
+                <w:lang w:eastAsia="fr-FR"/>
+              </w:rPr>
+              <w:t xml:space="preserve"> à établir sur les 30 premiers jours)</w:t>
             </w:r>
           </w:p>
         </w:tc>
@@ -14289,7 +15098,67 @@
                 <w:szCs w:val="22"/>
                 <w:lang w:eastAsia="fr-FR"/>
               </w:rPr>
-              <w:t>Taux d'exactitude du moteur calculer_devis() sur le jeu de tests de référence (golden dataset)</w:t>
+              <w:t xml:space="preserve">Taux d'exactitude du moteur </w:t>
+            </w:r>
+            <w:proofErr w:type="spellStart"/>
+            <w:r>
+              <w:rPr>
+                <w:rFonts w:eastAsia="Arial" w:cs="Arial"/>
+                <w:sz w:val="22"/>
+                <w:szCs w:val="22"/>
+                <w:lang w:eastAsia="fr-FR"/>
+              </w:rPr>
+              <w:t>calculer_</w:t>
+            </w:r>
+            <w:proofErr w:type="gramStart"/>
+            <w:r>
+              <w:rPr>
+                <w:rFonts w:eastAsia="Arial" w:cs="Arial"/>
+                <w:sz w:val="22"/>
+                <w:szCs w:val="22"/>
+                <w:lang w:eastAsia="fr-FR"/>
+              </w:rPr>
+              <w:t>devis</w:t>
+            </w:r>
+            <w:proofErr w:type="spellEnd"/>
+            <w:r>
+              <w:rPr>
+                <w:rFonts w:eastAsia="Arial" w:cs="Arial"/>
+                <w:sz w:val="22"/>
+                <w:szCs w:val="22"/>
+                <w:lang w:eastAsia="fr-FR"/>
+              </w:rPr>
+              <w:t>(</w:t>
+            </w:r>
+            <w:proofErr w:type="gramEnd"/>
+            <w:r>
+              <w:rPr>
+                <w:rFonts w:eastAsia="Arial" w:cs="Arial"/>
+                <w:sz w:val="22"/>
+                <w:szCs w:val="22"/>
+                <w:lang w:eastAsia="fr-FR"/>
+              </w:rPr>
+              <w:t xml:space="preserve">) sur le jeu de tests de référence (golden </w:t>
+            </w:r>
+            <w:proofErr w:type="spellStart"/>
+            <w:r>
+              <w:rPr>
+                <w:rFonts w:eastAsia="Arial" w:cs="Arial"/>
+                <w:sz w:val="22"/>
+                <w:szCs w:val="22"/>
+                <w:lang w:eastAsia="fr-FR"/>
+              </w:rPr>
+              <w:t>dataset</w:t>
+            </w:r>
+            <w:proofErr w:type="spellEnd"/>
+            <w:r>
+              <w:rPr>
+                <w:rFonts w:eastAsia="Arial" w:cs="Arial"/>
+                <w:sz w:val="22"/>
+                <w:szCs w:val="22"/>
+                <w:lang w:eastAsia="fr-FR"/>
+              </w:rPr>
+              <w:t>)</w:t>
             </w:r>
           </w:p>
         </w:tc>
@@ -14339,8 +15208,39 @@
                 <w:szCs w:val="22"/>
                 <w:lang w:eastAsia="fr-FR"/>
               </w:rPr>
-              <w:t>100 % sur les cas nominaux et limites documentés dans le golden dataset</w:t>
-            </w:r>
+              <w:t xml:space="preserve">100 % sur les cas nominaux et limites documentés dans </w:t>
+            </w:r>
+            <w:proofErr w:type="gramStart"/>
+            <w:r>
+              <w:rPr>
+                <w:rFonts w:eastAsia="Arial" w:cs="Arial"/>
+                <w:sz w:val="22"/>
+                <w:szCs w:val="22"/>
+                <w:lang w:eastAsia="fr-FR"/>
+              </w:rPr>
+              <w:t>le golden</w:t>
+            </w:r>
+            <w:proofErr w:type="gramEnd"/>
+            <w:r>
+              <w:rPr>
+                <w:rFonts w:eastAsia="Arial" w:cs="Arial"/>
+                <w:sz w:val="22"/>
+                <w:szCs w:val="22"/>
+                <w:lang w:eastAsia="fr-FR"/>
+              </w:rPr>
+              <w:t xml:space="preserve"> </w:t>
+            </w:r>
+            <w:proofErr w:type="spellStart"/>
+            <w:r>
+              <w:rPr>
+                <w:rFonts w:eastAsia="Arial" w:cs="Arial"/>
+                <w:sz w:val="22"/>
+                <w:szCs w:val="22"/>
+                <w:lang w:eastAsia="fr-FR"/>
+              </w:rPr>
+              <w:t>dataset</w:t>
+            </w:r>
+            <w:proofErr w:type="spellEnd"/>
           </w:p>
         </w:tc>
         <w:tc>
@@ -14551,7 +15451,27 @@
                 <w:szCs w:val="22"/>
                 <w:lang w:eastAsia="fr-FR"/>
               </w:rPr>
-              <w:t>Disponibilité du dashboard /admin avec affichage des KPIs à moins de 60 secondes de délai</w:t>
+              <w:t xml:space="preserve">Disponibilité du </w:t>
+            </w:r>
+            <w:proofErr w:type="spellStart"/>
+            <w:r>
+              <w:rPr>
+                <w:rFonts w:eastAsia="Arial" w:cs="Arial"/>
+                <w:sz w:val="22"/>
+                <w:szCs w:val="22"/>
+                <w:lang w:eastAsia="fr-FR"/>
+              </w:rPr>
+              <w:t>dashboard</w:t>
+            </w:r>
+            <w:proofErr w:type="spellEnd"/>
+            <w:r>
+              <w:rPr>
+                <w:rFonts w:eastAsia="Arial" w:cs="Arial"/>
+                <w:sz w:val="22"/>
+                <w:szCs w:val="22"/>
+                <w:lang w:eastAsia="fr-FR"/>
+              </w:rPr>
+              <w:t xml:space="preserve"> /admin avec affichage des KPIs à moins de 60 secondes de délai</w:t>
             </w:r>
           </w:p>
         </w:tc>
@@ -14576,8 +15496,39 @@
                 <w:szCs w:val="22"/>
                 <w:lang w:eastAsia="fr-FR"/>
               </w:rPr>
-              <w:t>Vérification manuelle : temps entre mise à jour Supabase et affichage dashboard</w:t>
-            </w:r>
+              <w:t xml:space="preserve">Vérification manuelle : temps entre mise à jour </w:t>
+            </w:r>
+            <w:proofErr w:type="spellStart"/>
+            <w:r>
+              <w:rPr>
+                <w:rFonts w:eastAsia="Arial" w:cs="Arial"/>
+                <w:sz w:val="22"/>
+                <w:szCs w:val="22"/>
+                <w:lang w:eastAsia="fr-FR"/>
+              </w:rPr>
+              <w:t>Supabase</w:t>
+            </w:r>
+            <w:proofErr w:type="spellEnd"/>
+            <w:r>
+              <w:rPr>
+                <w:rFonts w:eastAsia="Arial" w:cs="Arial"/>
+                <w:sz w:val="22"/>
+                <w:szCs w:val="22"/>
+                <w:lang w:eastAsia="fr-FR"/>
+              </w:rPr>
+              <w:t xml:space="preserve"> et affichage </w:t>
+            </w:r>
+            <w:proofErr w:type="spellStart"/>
+            <w:r>
+              <w:rPr>
+                <w:rFonts w:eastAsia="Arial" w:cs="Arial"/>
+                <w:sz w:val="22"/>
+                <w:szCs w:val="22"/>
+                <w:lang w:eastAsia="fr-FR"/>
+              </w:rPr>
+              <w:t>dashboard</w:t>
+            </w:r>
+            <w:proofErr w:type="spellEnd"/>
           </w:p>
         </w:tc>
         <w:tc>
@@ -14682,7 +15633,67 @@
                 <w:szCs w:val="22"/>
                 <w:lang w:eastAsia="fr-FR"/>
               </w:rPr>
-              <w:t>Somme des abonnements outils (n8n, Supabase, Netlify, Resend, LLM) facturés par mois</w:t>
+              <w:t xml:space="preserve">Somme des abonnements outils (n8n, </w:t>
+            </w:r>
+            <w:proofErr w:type="spellStart"/>
+            <w:r>
+              <w:rPr>
+                <w:rFonts w:eastAsia="Arial" w:cs="Arial"/>
+                <w:sz w:val="22"/>
+                <w:szCs w:val="22"/>
+                <w:lang w:eastAsia="fr-FR"/>
+              </w:rPr>
+              <w:t>Supabase</w:t>
+            </w:r>
+            <w:proofErr w:type="spellEnd"/>
+            <w:r>
+              <w:rPr>
+                <w:rFonts w:eastAsia="Arial" w:cs="Arial"/>
+                <w:sz w:val="22"/>
+                <w:szCs w:val="22"/>
+                <w:lang w:eastAsia="fr-FR"/>
+              </w:rPr>
+              <w:t xml:space="preserve">, </w:t>
+            </w:r>
+            <w:proofErr w:type="spellStart"/>
+            <w:r>
+              <w:rPr>
+                <w:rFonts w:eastAsia="Arial" w:cs="Arial"/>
+                <w:sz w:val="22"/>
+                <w:szCs w:val="22"/>
+                <w:lang w:eastAsia="fr-FR"/>
+              </w:rPr>
+              <w:t>Netlify</w:t>
+            </w:r>
+            <w:proofErr w:type="spellEnd"/>
+            <w:r>
+              <w:rPr>
+                <w:rFonts w:eastAsia="Arial" w:cs="Arial"/>
+                <w:sz w:val="22"/>
+                <w:szCs w:val="22"/>
+                <w:lang w:eastAsia="fr-FR"/>
+              </w:rPr>
+              <w:t xml:space="preserve">, </w:t>
+            </w:r>
+            <w:proofErr w:type="spellStart"/>
+            <w:r>
+              <w:rPr>
+                <w:rFonts w:eastAsia="Arial" w:cs="Arial"/>
+                <w:sz w:val="22"/>
+                <w:szCs w:val="22"/>
+                <w:lang w:eastAsia="fr-FR"/>
+              </w:rPr>
+              <w:t>Resend</w:t>
+            </w:r>
+            <w:proofErr w:type="spellEnd"/>
+            <w:r>
+              <w:rPr>
+                <w:rFonts w:eastAsia="Arial" w:cs="Arial"/>
+                <w:sz w:val="22"/>
+                <w:szCs w:val="22"/>
+                <w:lang w:eastAsia="fr-FR"/>
+              </w:rPr>
+              <w:t>, LLM) facturés par mois</w:t>
             </w:r>
           </w:p>
         </w:tc>
@@ -14778,7 +15789,15 @@
         <w:pStyle w:val="Normal1"/>
       </w:pPr>
       <w:r>
-        <w:t>Estimation illustrative du retour attendu, à affiner avec les données réelles de NeoTravel. Principe : l’automatisation ne crée pas de demande</w:t>
+        <w:t xml:space="preserve">Estimation illustrative du retour attendu, à affiner avec les données réelles de </w:t>
+      </w:r>
+      <w:proofErr w:type="spellStart"/>
+      <w:r>
+        <w:t>NeoTravel</w:t>
+      </w:r>
+      <w:proofErr w:type="spellEnd"/>
+      <w:r>
+        <w:t>. Principe : l’automatisation ne crée pas de demande</w:t>
       </w:r>
       <w:r>
         <w:t xml:space="preserve">, </w:t>
@@ -15368,7 +16387,6 @@
                 <w:sz w:val="22"/>
                 <w:szCs w:val="22"/>
               </w:rPr>
-              <w:lastRenderedPageBreak/>
               <w:t>Marge commerciale</w:t>
             </w:r>
           </w:p>
@@ -15435,6 +16453,7 @@
                 <w:sz w:val="22"/>
                 <w:szCs w:val="22"/>
               </w:rPr>
+              <w:lastRenderedPageBreak/>
               <w:t xml:space="preserve">Marge additionnelle estimée </w:t>
             </w:r>
             <w:r>
@@ -15579,21 +16598,36 @@
       <w:bookmarkStart w:id="35" w:name="_Toc233103960"/>
       <w:bookmarkStart w:id="36" w:name="_Toc233294574"/>
       <w:r>
-        <w:t>Coût de la solution &amp; payback</w:t>
+        <w:t xml:space="preserve">Coût de la solution &amp; </w:t>
+      </w:r>
+      <w:proofErr w:type="spellStart"/>
+      <w:r>
+        <w:t>payback</w:t>
       </w:r>
       <w:bookmarkEnd w:id="35"/>
       <w:bookmarkEnd w:id="36"/>
+      <w:proofErr w:type="spellEnd"/>
     </w:p>
     <w:p>
       <w:pPr>
         <w:pStyle w:val="Normal1"/>
       </w:pPr>
       <w:r>
-        <w:t xml:space="preserve">Coût des outils (Supabase, n8n, </w:t>
-      </w:r>
+        <w:t>Coût des outils (</w:t>
+      </w:r>
+      <w:proofErr w:type="spellStart"/>
+      <w:r>
+        <w:t>Supabase</w:t>
+      </w:r>
+      <w:proofErr w:type="spellEnd"/>
+      <w:r>
+        <w:t xml:space="preserve">, n8n, </w:t>
+      </w:r>
+      <w:proofErr w:type="spellStart"/>
       <w:r>
         <w:t>Netlify</w:t>
       </w:r>
+      <w:proofErr w:type="spellEnd"/>
       <w:r>
         <w:t xml:space="preserve">, emailing, crédit IA) : </w:t>
       </w:r>
@@ -15757,8 +16791,13 @@
         <w:t>,</w:t>
       </w:r>
       <w:r>
-        <w:t xml:space="preserve"> à valider avec les données réelles de NeoTravel</w:t>
-      </w:r>
+        <w:t xml:space="preserve"> à valider avec les données réelles de </w:t>
+      </w:r>
+      <w:proofErr w:type="spellStart"/>
+      <w:r>
+        <w:t>NeoTravel</w:t>
+      </w:r>
+      <w:proofErr w:type="spellEnd"/>
       <w:r>
         <w:t>. L</w:t>
       </w:r>
@@ -15790,7 +16829,15 @@
         <w:pStyle w:val="Normal1"/>
       </w:pPr>
       <w:r>
-        <w:t>Les zones non spécifiées par les règles de pricing sont tranchées par des hypothèses documentées (à valider a</w:t>
+        <w:t xml:space="preserve">Les zones non spécifiées par les règles de </w:t>
+      </w:r>
+      <w:proofErr w:type="spellStart"/>
+      <w:r>
+        <w:t>pricing</w:t>
+      </w:r>
+      <w:proofErr w:type="spellEnd"/>
+      <w:r>
+        <w:t xml:space="preserve"> sont tranchées par des hypothèses documentées (à valider a</w:t>
       </w:r>
       <w:r>
         <w:t>vec l’entreprise</w:t>
@@ -16033,8 +17080,42 @@
           <w:sz w:val="28"/>
           <w:szCs w:val="28"/>
         </w:rPr>
-        <w:t xml:space="preserve"> – Wireframe low fidelity</w:t>
-      </w:r>
+        <w:t xml:space="preserve"> – Wireframe </w:t>
+      </w:r>
+      <w:proofErr w:type="spellStart"/>
+      <w:r>
+        <w:rPr>
+          <w:b/>
+          <w:bCs/>
+          <w:color w:val="AEC826"/>
+          <w:sz w:val="28"/>
+          <w:szCs w:val="28"/>
+        </w:rPr>
+        <w:t>low</w:t>
+      </w:r>
+      <w:proofErr w:type="spellEnd"/>
+      <w:r>
+        <w:rPr>
+          <w:b/>
+          <w:bCs/>
+          <w:color w:val="AEC826"/>
+          <w:sz w:val="28"/>
+          <w:szCs w:val="28"/>
+        </w:rPr>
+        <w:t xml:space="preserve"> </w:t>
+      </w:r>
+      <w:proofErr w:type="spellStart"/>
+      <w:r>
+        <w:rPr>
+          <w:b/>
+          <w:bCs/>
+          <w:color w:val="AEC826"/>
+          <w:sz w:val="28"/>
+          <w:szCs w:val="28"/>
+        </w:rPr>
+        <w:t>fidelity</w:t>
+      </w:r>
+      <w:proofErr w:type="spellEnd"/>
     </w:p>
     <w:p>
       <w:pPr>
@@ -16369,7 +17450,31 @@
         <w:t xml:space="preserve">Agent IA : </w:t>
       </w:r>
       <w:r>
-        <w:t>Système où le LLM orchestre une tâche en plusieurs étapes et décide d'appeler des outils pour agir. Dans le projet, l'agent mène la conversation, qualifie la demande et délègue le calcul à calculer_devis(). À distinguer d'un simple chatbot qui ne fait que discuter.</w:t>
+        <w:t xml:space="preserve">Système où le LLM orchestre une tâche en plusieurs étapes et décide d'appeler des outils pour agir. Dans le projet, l'agent mène la conversation, qualifie la demande et délègue le calcul à </w:t>
+      </w:r>
+      <w:proofErr w:type="spellStart"/>
+      <w:r>
+        <w:t>calculer_</w:t>
+      </w:r>
+      <w:proofErr w:type="gramStart"/>
+      <w:r>
+        <w:t>devis</w:t>
+      </w:r>
+      <w:proofErr w:type="spellEnd"/>
+      <w:r>
+        <w:t>(</w:t>
+      </w:r>
+      <w:proofErr w:type="gramEnd"/>
+      <w:r>
+        <w:t xml:space="preserve">). À distinguer d'un simple </w:t>
+      </w:r>
+      <w:proofErr w:type="spellStart"/>
+      <w:r>
+        <w:t>chatbot</w:t>
+      </w:r>
+      <w:proofErr w:type="spellEnd"/>
+      <w:r>
+        <w:t xml:space="preserve"> qui ne fait que discuter.</w:t>
       </w:r>
     </w:p>
     <w:p>
@@ -16399,7 +17504,15 @@
         <w:t xml:space="preserve">Autocariste : </w:t>
       </w:r>
       <w:r>
-        <w:t>Entreprise propriétaire et exploitante d'autocars. NeoTravel ne possède pas de flotte propre mais s'appuie sur un réseau de partenaires autocaristes qualifiés.</w:t>
+        <w:t xml:space="preserve">Entreprise propriétaire et exploitante d'autocars. </w:t>
+      </w:r>
+      <w:proofErr w:type="spellStart"/>
+      <w:r>
+        <w:t>NeoTravel</w:t>
+      </w:r>
+      <w:proofErr w:type="spellEnd"/>
+      <w:r>
+        <w:t xml:space="preserve"> ne possède pas de flotte propre mais s'appuie sur un réseau de partenaires autocaristes qualifiés.</w:t>
       </w:r>
     </w:p>
     <w:p>
@@ -16421,30 +17534,40 @@
       <w:pPr>
         <w:pStyle w:val="Normal1"/>
       </w:pPr>
+      <w:proofErr w:type="spellStart"/>
       <w:r>
         <w:rPr>
           <w:b/>
           <w:bCs/>
         </w:rPr>
-        <w:t xml:space="preserve">Chatbot : </w:t>
-      </w:r>
-      <w:r>
-        <w:t>Interface conversationnelle permettant à un utilisateur d'interagir par messages texte. Dans le projet, le chatbot est intégré à la landing page et est piloté par l'agent IA. À distinguer de l'agent IA : le chatbot est l'interface, l'agent est le cerveau.</w:t>
-      </w:r>
-    </w:p>
-    <w:p>
-      <w:pPr>
-        <w:pStyle w:val="Normal1"/>
-      </w:pPr>
+        <w:t>Chatbot</w:t>
+      </w:r>
+      <w:proofErr w:type="spellEnd"/>
       <w:r>
         <w:rPr>
           <w:b/>
           <w:bCs/>
         </w:rPr>
-        <w:t xml:space="preserve">CRM (Customer Relationship Management) : </w:t>
-      </w:r>
-      <w:r>
-        <w:t>Outil de gestion de la relation client permettant de centraliser et suivre les leads, devis et interactions commerciales. Dans le projet, la base Supabase joue ce rôle.</w:t>
+        <w:t xml:space="preserve"> : </w:t>
+      </w:r>
+      <w:r>
+        <w:t xml:space="preserve">Interface conversationnelle permettant à un utilisateur d'interagir par messages texte. Dans le projet, le </w:t>
+      </w:r>
+      <w:proofErr w:type="spellStart"/>
+      <w:r>
+        <w:t>chatbot</w:t>
+      </w:r>
+      <w:proofErr w:type="spellEnd"/>
+      <w:r>
+        <w:t xml:space="preserve"> est intégré à la landing page et est piloté par l'agent IA. À distinguer de l'agent IA : le </w:t>
+      </w:r>
+      <w:proofErr w:type="spellStart"/>
+      <w:r>
+        <w:t>chatbot</w:t>
+      </w:r>
+      <w:proofErr w:type="spellEnd"/>
+      <w:r>
+        <w:t xml:space="preserve"> est l'interface, l'agent est le cerveau.</w:t>
       </w:r>
     </w:p>
     <w:p>
@@ -16456,10 +17579,18 @@
           <w:b/>
           <w:bCs/>
         </w:rPr>
-        <w:t xml:space="preserve">Dashboard : </w:t>
-      </w:r>
-      <w:r>
-        <w:t>Tableau de bord de pilotage donnant une vue en temps réel des indicateurs commerciaux (leads, devis, statuts, relances). Dans le projet : page /admin de l'app Next.js connectée à Supabase.</w:t>
+        <w:t xml:space="preserve">CRM (Customer Relationship Management) : </w:t>
+      </w:r>
+      <w:r>
+        <w:t xml:space="preserve">Outil de gestion de la relation client permettant de centraliser et suivre les leads, devis et interactions commerciales. Dans le projet, la base </w:t>
+      </w:r>
+      <w:proofErr w:type="spellStart"/>
+      <w:r>
+        <w:t>Supabase</w:t>
+      </w:r>
+      <w:proofErr w:type="spellEnd"/>
+      <w:r>
+        <w:t xml:space="preserve"> joue ce rôle.</w:t>
       </w:r>
     </w:p>
     <w:p>
@@ -16471,10 +17602,18 @@
           <w:b/>
           <w:bCs/>
         </w:rPr>
-        <w:t xml:space="preserve">Déterministe : </w:t>
-      </w:r>
-      <w:r>
-        <w:t>Se dit d'un calcul dont le résultat est toujours identique pour les mêmes entrées, sans aléatoire ni raisonnement. Le moteur calculer_devis() est déterministe ; le LLM ne l'est pas. Principe fondamental du projet : le prix est toujours calculé par le code, jamais par l'IA.</w:t>
+        <w:t xml:space="preserve">Dashboard : </w:t>
+      </w:r>
+      <w:r>
+        <w:t xml:space="preserve">Tableau de bord de pilotage donnant une vue en temps réel des indicateurs commerciaux (leads, devis, statuts, relances). Dans le projet : page /admin de l'app Next.js connectée à </w:t>
+      </w:r>
+      <w:proofErr w:type="spellStart"/>
+      <w:r>
+        <w:t>Supabase</w:t>
+      </w:r>
+      <w:proofErr w:type="spellEnd"/>
+      <w:r>
+        <w:t>.</w:t>
       </w:r>
     </w:p>
     <w:p>
@@ -16486,40 +17625,50 @@
           <w:b/>
           <w:bCs/>
         </w:rPr>
-        <w:t xml:space="preserve">Embedding (vecteur) : </w:t>
-      </w:r>
-      <w:r>
-        <w:t>Représentation numérique d'un texte qui capture son sens. Base de la recherche sémantique, permettant de retrouver des informations par similarité de sens plutôt que par mots-clés exacts.</w:t>
+        <w:t xml:space="preserve">Déterministe : </w:t>
+      </w:r>
+      <w:r>
+        <w:t xml:space="preserve">Se dit d'un calcul dont le résultat est toujours identique pour les mêmes entrées, sans aléatoire ni raisonnement. Le moteur </w:t>
+      </w:r>
+      <w:proofErr w:type="spellStart"/>
+      <w:r>
+        <w:t>calculer_</w:t>
+      </w:r>
+      <w:proofErr w:type="gramStart"/>
+      <w:r>
+        <w:t>devis</w:t>
+      </w:r>
+      <w:proofErr w:type="spellEnd"/>
+      <w:r>
+        <w:t>(</w:t>
+      </w:r>
+      <w:proofErr w:type="gramEnd"/>
+      <w:r>
+        <w:t>) est déterministe ; le LLM ne l'est pas. Principe fondamental du projet : le prix est toujours calculé par le code, jamais par l'IA.</w:t>
       </w:r>
     </w:p>
     <w:p>
       <w:pPr>
         <w:pStyle w:val="Normal1"/>
       </w:pPr>
+      <w:proofErr w:type="spellStart"/>
       <w:r>
         <w:rPr>
           <w:b/>
           <w:bCs/>
         </w:rPr>
-        <w:t xml:space="preserve">Escalade humaine : </w:t>
-      </w:r>
-      <w:r>
-        <w:t>Action de transférer un cas à un commercial lorsque l'agent détecte une situation complexe qu'il ne peut pas traiter seul. Correspond au scénario 7 du projet.</w:t>
-      </w:r>
-    </w:p>
-    <w:p>
-      <w:pPr>
-        <w:pStyle w:val="Normal1"/>
-      </w:pPr>
+        <w:t>Embedding</w:t>
+      </w:r>
+      <w:proofErr w:type="spellEnd"/>
       <w:r>
         <w:rPr>
           <w:b/>
           <w:bCs/>
         </w:rPr>
-        <w:t xml:space="preserve">Fenêtre de contexte : </w:t>
-      </w:r>
-      <w:r>
-        <w:t>Quantité maximale de tokens que le modèle LLM peut traiter en une seule fois (prompt + historique + réponse). Elle est finie et conditionne la quantité d'information que l'agent peut prendre en compte.</w:t>
+        <w:t xml:space="preserve"> (vecteur) : </w:t>
+      </w:r>
+      <w:r>
+        <w:t>Représentation numérique d'un texte qui capture son sens. Base de la recherche sémantique, permettant de retrouver des informations par similarité de sens plutôt que par mots-clés exacts.</w:t>
       </w:r>
     </w:p>
     <w:p>
@@ -16531,10 +17680,10 @@
           <w:b/>
           <w:bCs/>
         </w:rPr>
-        <w:t xml:space="preserve">Friction : </w:t>
-      </w:r>
-      <w:r>
-        <w:t>Point de blocage ou d'inefficacité dans un processus. Deux frictions principales identifiées chez NeoTravel : la priorisation commerciale biaisée (Friction 1) et l'acquisition bridée par la charge manuelle (Friction 2).</w:t>
+        <w:t xml:space="preserve">Escalade humaine : </w:t>
+      </w:r>
+      <w:r>
+        <w:t>Action de transférer un cas à un commercial lorsque l'agent détecte une situation complexe qu'il ne peut pas traiter seul. Correspond au scénario 7 du projet.</w:t>
       </w:r>
     </w:p>
     <w:p>
@@ -16546,10 +17695,18 @@
           <w:b/>
           <w:bCs/>
         </w:rPr>
-        <w:t xml:space="preserve">Garde-fou (Guardrail) : </w:t>
-      </w:r>
-      <w:r>
-        <w:t>Règle ou mécanisme empêchant un comportement indésirable du système. Dans le projet : le prix provient toujours de calculer_devis(), jamais du raisonnement du LLM.</w:t>
+        <w:t xml:space="preserve">Fenêtre de contexte : </w:t>
+      </w:r>
+      <w:r>
+        <w:t xml:space="preserve">Quantité maximale de </w:t>
+      </w:r>
+      <w:proofErr w:type="spellStart"/>
+      <w:r>
+        <w:t>tokens</w:t>
+      </w:r>
+      <w:proofErr w:type="spellEnd"/>
+      <w:r>
+        <w:t xml:space="preserve"> que le modèle LLM peut traiter en une seule fois (prompt + historique + réponse). Elle est finie et conditionne la quantité d'information que l'agent peut prendre en compte.</w:t>
       </w:r>
     </w:p>
     <w:p>
@@ -16561,10 +17718,18 @@
           <w:b/>
           <w:bCs/>
         </w:rPr>
-        <w:t xml:space="preserve">Goulot d'étranglement : </w:t>
-      </w:r>
-      <w:r>
-        <w:t>Point d'un processus où la capacité de traitement est inférieure au flux entrant, créant un ralentissement structurel. Ici : le traitement manuel des 60 leads/jour.</w:t>
+        <w:t xml:space="preserve">Friction : </w:t>
+      </w:r>
+      <w:r>
+        <w:t xml:space="preserve">Point de blocage ou d'inefficacité dans un processus. Deux frictions principales identifiées chez </w:t>
+      </w:r>
+      <w:proofErr w:type="spellStart"/>
+      <w:r>
+        <w:t>NeoTravel</w:t>
+      </w:r>
+      <w:proofErr w:type="spellEnd"/>
+      <w:r>
+        <w:t xml:space="preserve"> : la priorisation commerciale biaisée (Friction 1) et l'acquisition bridée par la charge manuelle (Friction 2).</w:t>
       </w:r>
     </w:p>
     <w:p>
@@ -16576,21 +17741,83 @@
           <w:b/>
           <w:bCs/>
         </w:rPr>
-        <w:t xml:space="preserve">Hallucination : </w:t>
-      </w:r>
-      <w:r>
-        <w:t>Réponse produite par un LLM qui est fluide et plausible mais factuellement fausse ou inventée. Risque principal justifiant que le prix soit calculé par le code et non par le modèle.</w:t>
-      </w:r>
-    </w:p>
-    <w:p>
-      <w:pPr>
-        <w:pStyle w:val="Normal1"/>
-      </w:pPr>
+        <w:t>Garde-fou (</w:t>
+      </w:r>
+      <w:proofErr w:type="spellStart"/>
       <w:r>
         <w:rPr>
           <w:b/>
           <w:bCs/>
         </w:rPr>
+        <w:t>Guardrail</w:t>
+      </w:r>
+      <w:proofErr w:type="spellEnd"/>
+      <w:r>
+        <w:rPr>
+          <w:b/>
+          <w:bCs/>
+        </w:rPr>
+        <w:t xml:space="preserve">) : </w:t>
+      </w:r>
+      <w:r>
+        <w:t xml:space="preserve">Règle ou mécanisme empêchant un comportement indésirable du système. Dans le projet : le prix provient toujours de </w:t>
+      </w:r>
+      <w:proofErr w:type="spellStart"/>
+      <w:r>
+        <w:t>calculer_</w:t>
+      </w:r>
+      <w:proofErr w:type="gramStart"/>
+      <w:r>
+        <w:t>devis</w:t>
+      </w:r>
+      <w:proofErr w:type="spellEnd"/>
+      <w:r>
+        <w:t>(</w:t>
+      </w:r>
+      <w:proofErr w:type="gramEnd"/>
+      <w:r>
+        <w:t>), jamais du raisonnement du LLM.</w:t>
+      </w:r>
+    </w:p>
+    <w:p>
+      <w:pPr>
+        <w:pStyle w:val="Normal1"/>
+      </w:pPr>
+      <w:r>
+        <w:rPr>
+          <w:b/>
+          <w:bCs/>
+        </w:rPr>
+        <w:t xml:space="preserve">Goulot d'étranglement : </w:t>
+      </w:r>
+      <w:r>
+        <w:t>Point d'un processus où la capacité de traitement est inférieure au flux entrant, créant un ralentissement structurel. Ici : le traitement manuel des 60 leads/jour.</w:t>
+      </w:r>
+    </w:p>
+    <w:p>
+      <w:pPr>
+        <w:pStyle w:val="Normal1"/>
+      </w:pPr>
+      <w:r>
+        <w:rPr>
+          <w:b/>
+          <w:bCs/>
+        </w:rPr>
+        <w:t xml:space="preserve">Hallucination : </w:t>
+      </w:r>
+      <w:r>
+        <w:t>Réponse produite par un LLM qui est fluide et plausible mais factuellement fausse ou inventée. Risque principal justifiant que le prix soit calculé par le code et non par le modèle.</w:t>
+      </w:r>
+    </w:p>
+    <w:p>
+      <w:pPr>
+        <w:pStyle w:val="Normal1"/>
+      </w:pPr>
+      <w:r>
+        <w:rPr>
+          <w:b/>
+          <w:bCs/>
+        </w:rPr>
         <w:lastRenderedPageBreak/>
         <w:t xml:space="preserve">HITL (Human-In-The-Loop) : </w:t>
       </w:r>
@@ -16610,7 +17837,15 @@
         <w:t xml:space="preserve">HT (Hors Taxes) : </w:t>
       </w:r>
       <w:r>
-        <w:t>Montant avant application de la TVA. Utilisé dans le calcul du panier moyen des prestations NeoTravel (1 500 € HT par prestation).</w:t>
+        <w:t xml:space="preserve">Montant avant application de la TVA. Utilisé dans le calcul du panier moyen des prestations </w:t>
+      </w:r>
+      <w:proofErr w:type="spellStart"/>
+      <w:r>
+        <w:t>NeoTravel</w:t>
+      </w:r>
+      <w:proofErr w:type="spellEnd"/>
+      <w:r>
+        <w:t xml:space="preserve"> (1 500 € HT par prestation).</w:t>
       </w:r>
     </w:p>
     <w:p>
@@ -16670,7 +17905,15 @@
         <w:t xml:space="preserve">Intermédiation : </w:t>
       </w:r>
       <w:r>
-        <w:t>Modèle économique dans lequel une entreprise joue le rôle d'intermédiaire entre une offre et une demande. NeoTravel ne possède pas de flotte, elle met en relation des prospects avec des autocaristes partenaires.</w:t>
+        <w:t xml:space="preserve">Modèle économique dans lequel une entreprise joue le rôle d'intermédiaire entre une offre et une demande. </w:t>
+      </w:r>
+      <w:proofErr w:type="spellStart"/>
+      <w:r>
+        <w:t>NeoTravel</w:t>
+      </w:r>
+      <w:proofErr w:type="spellEnd"/>
+      <w:r>
+        <w:t xml:space="preserve"> ne possède pas de flotte, elle met en relation des prospects avec des autocaristes partenaires.</w:t>
       </w:r>
     </w:p>
     <w:p>
@@ -16685,7 +17928,23 @@
         <w:t xml:space="preserve">JS (JavaScript) : </w:t>
       </w:r>
       <w:r>
-        <w:t>Langage de programmation utilisé dans le nœud Code n8n qui héberge calculer_devis().</w:t>
+        <w:t xml:space="preserve">Langage de programmation utilisé dans le nœud Code n8n qui héberge </w:t>
+      </w:r>
+      <w:proofErr w:type="spellStart"/>
+      <w:r>
+        <w:t>calculer_</w:t>
+      </w:r>
+      <w:proofErr w:type="gramStart"/>
+      <w:r>
+        <w:t>devis</w:t>
+      </w:r>
+      <w:proofErr w:type="spellEnd"/>
+      <w:r>
+        <w:t>(</w:t>
+      </w:r>
+      <w:proofErr w:type="gramEnd"/>
+      <w:r>
+        <w:t>).</w:t>
       </w:r>
     </w:p>
     <w:p>
@@ -16700,7 +17959,23 @@
         <w:t xml:space="preserve">JSON (JavaScript Object Notation) : </w:t>
       </w:r>
       <w:r>
-        <w:t>Format de données structuré (texte) utilisé pour échanger des informations entre l'agent et le moteur de calcul. Le LLM est invité à produire du JSON, puis ce dernier est nettoyé et validé côté code avant d'appeler calculer_devis().</w:t>
+        <w:t xml:space="preserve">Format de données structuré (texte) utilisé pour échanger des informations entre l'agent et le moteur de calcul. Le LLM est invité à produire du JSON, puis ce dernier est nettoyé et validé côté code avant d'appeler </w:t>
+      </w:r>
+      <w:proofErr w:type="spellStart"/>
+      <w:r>
+        <w:t>calculer_</w:t>
+      </w:r>
+      <w:proofErr w:type="gramStart"/>
+      <w:r>
+        <w:t>devis</w:t>
+      </w:r>
+      <w:proofErr w:type="spellEnd"/>
+      <w:r>
+        <w:t>(</w:t>
+      </w:r>
+      <w:proofErr w:type="gramEnd"/>
+      <w:r>
+        <w:t>).</w:t>
       </w:r>
     </w:p>
     <w:p>
@@ -16730,7 +18005,15 @@
         <w:t xml:space="preserve">Landing page : </w:t>
       </w:r>
       <w:r>
-        <w:t>Page web d'accueil conçue pour capter et convertir les visiteurs en leads. Dans le projet, elle intègre le chatbot conversationnel qui remplace le formulaire classique.</w:t>
+        <w:t xml:space="preserve">Page web d'accueil conçue pour capter et convertir les visiteurs en leads. Dans le projet, elle intègre le </w:t>
+      </w:r>
+      <w:proofErr w:type="spellStart"/>
+      <w:r>
+        <w:t>chatbot</w:t>
+      </w:r>
+      <w:proofErr w:type="spellEnd"/>
+      <w:r>
+        <w:t xml:space="preserve"> conversationnel qui remplace le formulaire classique.</w:t>
       </w:r>
     </w:p>
     <w:p>
@@ -16745,7 +18028,15 @@
         <w:t xml:space="preserve">Lead : </w:t>
       </w:r>
       <w:r>
-        <w:t>Contact entrant ayant exprimé un intérêt commercial (prospect ayant soumis une demande). NeoTravel reçoit environ 60 leads par jour.</w:t>
+        <w:t xml:space="preserve">Contact entrant ayant exprimé un intérêt commercial (prospect ayant soumis une demande). </w:t>
+      </w:r>
+      <w:proofErr w:type="spellStart"/>
+      <w:r>
+        <w:t>NeoTravel</w:t>
+      </w:r>
+      <w:proofErr w:type="spellEnd"/>
+      <w:r>
+        <w:t xml:space="preserve"> reçoit environ 60 leads par jour.</w:t>
       </w:r>
     </w:p>
     <w:p>
@@ -16757,40 +18048,26 @@
           <w:b/>
           <w:bCs/>
         </w:rPr>
-        <w:t xml:space="preserve">LLM (Large Language Model) : </w:t>
-      </w:r>
-      <w:r>
-        <w:t>Modèle de langage de grande taille qui génère du texte plausible par prédiction statistique. Il assiste et formule ; il ne calcule jamais le prix. Dans le projet : Gemma 4 via Google AI Studio.</w:t>
-      </w:r>
-    </w:p>
-    <w:p>
-      <w:pPr>
-        <w:pStyle w:val="Normal1"/>
-      </w:pPr>
+        <w:t xml:space="preserve">LLM (Large </w:t>
+      </w:r>
+      <w:proofErr w:type="spellStart"/>
       <w:r>
         <w:rPr>
           <w:b/>
           <w:bCs/>
         </w:rPr>
-        <w:t xml:space="preserve">Machine à états : </w:t>
-      </w:r>
-      <w:r>
-        <w:t>Modèle formel décrivant tous les statuts possibles d'un objet et les transitions autorisées entre eux. Dans le projet : statuts d'une demande (nouveau → qualifié → devis envoyé → accepté / refusé / relancé).</w:t>
-      </w:r>
-    </w:p>
-    <w:p>
-      <w:pPr>
-        <w:pStyle w:val="Normal1"/>
-      </w:pPr>
+        <w:t>Language</w:t>
+      </w:r>
+      <w:proofErr w:type="spellEnd"/>
       <w:r>
         <w:rPr>
           <w:b/>
           <w:bCs/>
         </w:rPr>
-        <w:t xml:space="preserve">MCP (Model Context Protocol) : </w:t>
-      </w:r>
-      <w:r>
-        <w:t>Protocole standard pour connecter un agent IA à des outils et des données externes de manière structurée.</w:t>
+        <w:t xml:space="preserve"> Model) : </w:t>
+      </w:r>
+      <w:r>
+        <w:t>Modèle de langage de grande taille qui génère du texte plausible par prédiction statistique. Il assiste et formule ; il ne calcule jamais le prix. Dans le projet : Gemma 4 via Google AI Studio.</w:t>
       </w:r>
     </w:p>
     <w:p>
@@ -16802,10 +18079,10 @@
           <w:b/>
           <w:bCs/>
         </w:rPr>
-        <w:t xml:space="preserve">Moteur de règles : </w:t>
-      </w:r>
-      <w:r>
-        <w:t>Composant logiciel qui applique des règles métier fixes et auditables pour produire un résultat. Dans le projet : calculer_devis() applique les grilles tarifaires NeoTravel de façon déterministe, sans intervention du LLM.</w:t>
+        <w:t xml:space="preserve">Machine à états : </w:t>
+      </w:r>
+      <w:r>
+        <w:t>Modèle formel décrivant tous les statuts possibles d'un objet et les transitions autorisées entre eux. Dans le projet : statuts d'une demande (nouveau → qualifié → devis envoyé → accepté / refusé / relancé).</w:t>
       </w:r>
     </w:p>
     <w:p>
@@ -16817,6 +18094,76 @@
           <w:b/>
           <w:bCs/>
         </w:rPr>
+        <w:t xml:space="preserve">MCP (Model </w:t>
+      </w:r>
+      <w:proofErr w:type="spellStart"/>
+      <w:r>
+        <w:rPr>
+          <w:b/>
+          <w:bCs/>
+        </w:rPr>
+        <w:t>Context</w:t>
+      </w:r>
+      <w:proofErr w:type="spellEnd"/>
+      <w:r>
+        <w:rPr>
+          <w:b/>
+          <w:bCs/>
+        </w:rPr>
+        <w:t xml:space="preserve"> Protocol) : </w:t>
+      </w:r>
+      <w:r>
+        <w:t>Protocole standard pour connecter un agent IA à des outils et des données externes de manière structurée.</w:t>
+      </w:r>
+    </w:p>
+    <w:p>
+      <w:pPr>
+        <w:pStyle w:val="Normal1"/>
+      </w:pPr>
+      <w:r>
+        <w:rPr>
+          <w:b/>
+          <w:bCs/>
+        </w:rPr>
+        <w:t xml:space="preserve">Moteur de règles : </w:t>
+      </w:r>
+      <w:r>
+        <w:t xml:space="preserve">Composant logiciel qui applique des règles métier fixes et auditables pour produire un résultat. Dans le projet : </w:t>
+      </w:r>
+      <w:proofErr w:type="spellStart"/>
+      <w:r>
+        <w:t>calculer_</w:t>
+      </w:r>
+      <w:proofErr w:type="gramStart"/>
+      <w:r>
+        <w:t>devis</w:t>
+      </w:r>
+      <w:proofErr w:type="spellEnd"/>
+      <w:r>
+        <w:t>(</w:t>
+      </w:r>
+      <w:proofErr w:type="gramEnd"/>
+      <w:r>
+        <w:t xml:space="preserve">) applique les grilles tarifaires </w:t>
+      </w:r>
+      <w:proofErr w:type="spellStart"/>
+      <w:r>
+        <w:t>NeoTravel</w:t>
+      </w:r>
+      <w:proofErr w:type="spellEnd"/>
+      <w:r>
+        <w:t xml:space="preserve"> de façon déterministe, sans intervention du LLM.</w:t>
+      </w:r>
+    </w:p>
+    <w:p>
+      <w:pPr>
+        <w:pStyle w:val="Normal1"/>
+      </w:pPr>
+      <w:r>
+        <w:rPr>
+          <w:b/>
+          <w:bCs/>
+        </w:rPr>
         <w:lastRenderedPageBreak/>
         <w:t xml:space="preserve">MVP (Minimum Viable Product) : </w:t>
       </w:r>
@@ -16866,37 +18213,39 @@
         <w:t xml:space="preserve">Panier moyen : </w:t>
       </w:r>
       <w:r>
-        <w:t>Valeur moyenne d'une transaction commerciale. Dans le calcul du ROI estimé : 1 500 € HT par prestation NeoTravel.</w:t>
+        <w:t xml:space="preserve">Valeur moyenne d'une transaction commerciale. Dans le calcul du ROI estimé : 1 500 € HT par prestation </w:t>
+      </w:r>
+      <w:proofErr w:type="spellStart"/>
+      <w:r>
+        <w:t>NeoTravel</w:t>
+      </w:r>
+      <w:proofErr w:type="spellEnd"/>
+      <w:r>
+        <w:t>.</w:t>
       </w:r>
     </w:p>
     <w:p>
       <w:pPr>
         <w:pStyle w:val="Normal1"/>
       </w:pPr>
+      <w:proofErr w:type="spellStart"/>
       <w:r>
         <w:rPr>
           <w:b/>
           <w:bCs/>
         </w:rPr>
-        <w:t xml:space="preserve">Payback : </w:t>
-      </w:r>
-      <w:r>
-        <w:t>Délai au bout duquel un investissement est remboursé par les gains générés. Dans le projet, estimé à moins d'un mois grâce aux gains liés à l'automatisation.</w:t>
-      </w:r>
-    </w:p>
-    <w:p>
-      <w:pPr>
-        <w:pStyle w:val="Normal1"/>
-      </w:pPr>
+        <w:t>Payback</w:t>
+      </w:r>
+      <w:proofErr w:type="spellEnd"/>
       <w:r>
         <w:rPr>
           <w:b/>
           <w:bCs/>
         </w:rPr>
-        <w:t xml:space="preserve">PDF (Portable Document Format) : </w:t>
-      </w:r>
-      <w:r>
-        <w:t>Format de fichier utilisé pour générer et envoyer les devis aux prospects de manière standardisée et non modifiable.</w:t>
+        <w:t xml:space="preserve"> : </w:t>
+      </w:r>
+      <w:r>
+        <w:t>Délai au bout duquel un investissement est remboursé par les gains générés. Dans le projet, estimé à moins d'un mois grâce aux gains liés à l'automatisation.</w:t>
       </w:r>
     </w:p>
     <w:p>
@@ -16908,10 +18257,10 @@
           <w:b/>
           <w:bCs/>
         </w:rPr>
-        <w:t xml:space="preserve">PII (Personally Identifiable Information) : </w:t>
-      </w:r>
-      <w:r>
-        <w:t>Données à caractère personnel. Toute information permettant d'identifier directement ou indirectement une personne. Le projet impose qu'aucune PII ne circule en clair dans les logs (conformité RGPD).</w:t>
+        <w:t xml:space="preserve">PDF (Portable Document Format) : </w:t>
+      </w:r>
+      <w:r>
+        <w:t>Format de fichier utilisé pour générer et envoyer les devis aux prospects de manière standardisée et non modifiable.</w:t>
       </w:r>
     </w:p>
     <w:p>
@@ -16923,40 +18272,26 @@
           <w:b/>
           <w:bCs/>
         </w:rPr>
-        <w:t xml:space="preserve">Pipeline commercial : </w:t>
-      </w:r>
-      <w:r>
-        <w:t>Vue d'ensemble des opportunités commerciales classées par statut, du premier contact jusqu'à la signature. Suivi en temps réel via le dashboard.</w:t>
-      </w:r>
-    </w:p>
-    <w:p>
-      <w:pPr>
-        <w:pStyle w:val="Normal1"/>
-      </w:pPr>
+        <w:t>PII (</w:t>
+      </w:r>
+      <w:proofErr w:type="spellStart"/>
       <w:r>
         <w:rPr>
           <w:b/>
           <w:bCs/>
         </w:rPr>
-        <w:t xml:space="preserve">PME (Petite et Moyenne Entreprise) : </w:t>
-      </w:r>
-      <w:r>
-        <w:t>Catégorie d'entreprise dont les effectifs et le chiffre d'affaires sont inférieurs à certains seuils légaux. NeoTravel est une PME fondée en 2010.</w:t>
-      </w:r>
-    </w:p>
-    <w:p>
-      <w:pPr>
-        <w:pStyle w:val="Normal1"/>
-      </w:pPr>
+        <w:t>Personally</w:t>
+      </w:r>
+      <w:proofErr w:type="spellEnd"/>
       <w:r>
         <w:rPr>
           <w:b/>
           <w:bCs/>
         </w:rPr>
-        <w:t xml:space="preserve">Prompt : </w:t>
-      </w:r>
-      <w:r>
-        <w:t>Texte fourni au LLM pour guider sa réponse (question, instruction, contexte). Le prompt système définit le rôle et les règles de comportement de l'agent sur toute la conversation.</w:t>
+        <w:t xml:space="preserve"> Identifiable Information) : </w:t>
+      </w:r>
+      <w:r>
+        <w:t>Données à caractère personnel. Toute information permettant d'identifier directement ou indirectement une personne. Le projet impose qu'aucune PII ne circule en clair dans les logs (conformité RGPD).</w:t>
       </w:r>
     </w:p>
     <w:p>
@@ -16968,10 +18303,18 @@
           <w:b/>
           <w:bCs/>
         </w:rPr>
-        <w:t xml:space="preserve">Prompt engineering : </w:t>
-      </w:r>
-      <w:r>
-        <w:t>L'art de formuler des prompts clairs et efficaces pour obtenir des réponses fiables et bien formatées de la part d'un LLM (consignes précises, exemples, format attendu).</w:t>
+        <w:t xml:space="preserve">Pipeline commercial : </w:t>
+      </w:r>
+      <w:r>
+        <w:t xml:space="preserve">Vue d'ensemble des opportunités commerciales classées par statut, du premier contact jusqu'à la signature. Suivi en temps réel via le </w:t>
+      </w:r>
+      <w:proofErr w:type="spellStart"/>
+      <w:r>
+        <w:t>dashboard</w:t>
+      </w:r>
+      <w:proofErr w:type="spellEnd"/>
+      <w:r>
+        <w:t>.</w:t>
       </w:r>
     </w:p>
     <w:p>
@@ -16983,10 +18326,18 @@
           <w:b/>
           <w:bCs/>
         </w:rPr>
-        <w:t xml:space="preserve">Prototype : </w:t>
-      </w:r>
-      <w:r>
-        <w:t>Version fonctionnelle mais non industrielle d'un produit, destinée à démontrer la faisabilité d'une solution et à valider les choix techniques. Le livrable de la semaine est un prototype, pas une application prête pour la production.</w:t>
+        <w:t xml:space="preserve">PME (Petite et Moyenne Entreprise) : </w:t>
+      </w:r>
+      <w:r>
+        <w:t xml:space="preserve">Catégorie d'entreprise dont les effectifs et le chiffre d'affaires sont inférieurs à certains seuils légaux. </w:t>
+      </w:r>
+      <w:proofErr w:type="spellStart"/>
+      <w:r>
+        <w:t>NeoTravel</w:t>
+      </w:r>
+      <w:proofErr w:type="spellEnd"/>
+      <w:r>
+        <w:t xml:space="preserve"> est une PME fondée en 2010.</w:t>
       </w:r>
     </w:p>
     <w:p>
@@ -16998,10 +18349,10 @@
           <w:b/>
           <w:bCs/>
         </w:rPr>
-        <w:t xml:space="preserve">Qualification : </w:t>
-      </w:r>
-      <w:r>
-        <w:t>Étape où l'agent vérifie qu'une demande contient tous les champs nécessaires (date, destination, nombre de passagers…) avant de déclencher le calcul du devis. À distinguer de la validation d'un prix ou d'un engagement commercial.</w:t>
+        <w:t xml:space="preserve">Prompt : </w:t>
+      </w:r>
+      <w:r>
+        <w:t>Texte fourni au LLM pour guider sa réponse (question, instruction, contexte). Le prompt système définit le rôle et les règles de comportement de l'agent sur toute la conversation.</w:t>
       </w:r>
     </w:p>
     <w:p>
@@ -17013,10 +18364,10 @@
           <w:b/>
           <w:bCs/>
         </w:rPr>
-        <w:t xml:space="preserve">RAG (Retrieval-Augmented Generation) : </w:t>
-      </w:r>
-      <w:r>
-        <w:t>Technique qui consiste à aller chercher des extraits pertinents dans une base de données avant de répondre, afin d'ancrer la réponse sur des sources vérifiées plutôt que sur la mémoire du modèle.</w:t>
+        <w:t xml:space="preserve">Prompt engineering : </w:t>
+      </w:r>
+      <w:r>
+        <w:t>L'art de formuler des prompts clairs et efficaces pour obtenir des réponses fiables et bien formatées de la part d'un LLM (consignes précises, exemples, format attendu).</w:t>
       </w:r>
     </w:p>
     <w:p>
@@ -17028,10 +18379,10 @@
           <w:b/>
           <w:bCs/>
         </w:rPr>
-        <w:t xml:space="preserve">Relance : </w:t>
-      </w:r>
-      <w:r>
-        <w:t>Action automatisée d'envoi d'un email de rappel à un prospect n'ayant pas répondu à un devis dans un délai défini (J+2 pour les urgents, J+3 et J+7 pour les standards, 2 relances maximum).</w:t>
+        <w:t xml:space="preserve">Prototype : </w:t>
+      </w:r>
+      <w:r>
+        <w:t>Version fonctionnelle mais non industrielle d'un produit, destinée à démontrer la faisabilité d'une solution et à valider les choix techniques. Le livrable de la semaine est un prototype, pas une application prête pour la production.</w:t>
       </w:r>
     </w:p>
     <w:p>
@@ -17043,6 +18394,91 @@
           <w:b/>
           <w:bCs/>
         </w:rPr>
+        <w:t xml:space="preserve">Qualification : </w:t>
+      </w:r>
+      <w:r>
+        <w:t>Étape où l'agent vérifie qu'une demande contient tous les champs nécessaires (date, destination, nombre de passagers…) avant de déclencher le calcul du devis. À distinguer de la validation d'un prix ou d'un engagement commercial.</w:t>
+      </w:r>
+    </w:p>
+    <w:p>
+      <w:pPr>
+        <w:pStyle w:val="Normal1"/>
+      </w:pPr>
+      <w:r>
+        <w:rPr>
+          <w:b/>
+          <w:bCs/>
+        </w:rPr>
+        <w:t>RAG (</w:t>
+      </w:r>
+      <w:proofErr w:type="spellStart"/>
+      <w:r>
+        <w:rPr>
+          <w:b/>
+          <w:bCs/>
+        </w:rPr>
+        <w:t>Retrieval-Augmented</w:t>
+      </w:r>
+      <w:proofErr w:type="spellEnd"/>
+      <w:r>
+        <w:rPr>
+          <w:b/>
+          <w:bCs/>
+        </w:rPr>
+        <w:t xml:space="preserve"> </w:t>
+      </w:r>
+      <w:proofErr w:type="spellStart"/>
+      <w:r>
+        <w:rPr>
+          <w:b/>
+          <w:bCs/>
+        </w:rPr>
+        <w:t>Generation</w:t>
+      </w:r>
+      <w:proofErr w:type="spellEnd"/>
+      <w:r>
+        <w:rPr>
+          <w:b/>
+          <w:bCs/>
+        </w:rPr>
+        <w:t xml:space="preserve">) : </w:t>
+      </w:r>
+      <w:r>
+        <w:t>Technique qui consiste à aller chercher des extraits pertinents dans une base de données avant de répondre, afin d'ancrer la réponse sur des sources vérifiées plutôt que sur la mémoire du modèle.</w:t>
+      </w:r>
+    </w:p>
+    <w:p>
+      <w:pPr>
+        <w:pStyle w:val="Normal1"/>
+      </w:pPr>
+      <w:r>
+        <w:rPr>
+          <w:b/>
+          <w:bCs/>
+        </w:rPr>
+        <w:t xml:space="preserve">Relance : </w:t>
+      </w:r>
+      <w:r>
+        <w:t xml:space="preserve">Action automatisée d'envoi d'un </w:t>
+      </w:r>
+      <w:proofErr w:type="gramStart"/>
+      <w:r>
+        <w:t>email</w:t>
+      </w:r>
+      <w:proofErr w:type="gramEnd"/>
+      <w:r>
+        <w:t xml:space="preserve"> de rappel à un prospect n'ayant pas répondu à un devis dans un délai défini (J+2 pour les urgents, J+3 et J+7 pour les standards, 2 relances maximum).</w:t>
+      </w:r>
+    </w:p>
+    <w:p>
+      <w:pPr>
+        <w:pStyle w:val="Normal1"/>
+      </w:pPr>
+      <w:r>
+        <w:rPr>
+          <w:b/>
+          <w:bCs/>
+        </w:rPr>
         <w:lastRenderedPageBreak/>
         <w:t xml:space="preserve">RGPD (Règlement Général sur la Protection des Données) : </w:t>
       </w:r>
@@ -17062,7 +18498,15 @@
         <w:t xml:space="preserve">RLS (Row Level Security) : </w:t>
       </w:r>
       <w:r>
-        <w:t>Mécanisme de sécurité de Supabase/PostgreSQL qui contrôle l'accès aux données ligne par ligne : un prospect ne voit que ses propres demandes et devis, un administrateur voit l'ensemble du pipeline.</w:t>
+        <w:t xml:space="preserve">Mécanisme de sécurité de </w:t>
+      </w:r>
+      <w:proofErr w:type="spellStart"/>
+      <w:r>
+        <w:t>Supabase</w:t>
+      </w:r>
+      <w:proofErr w:type="spellEnd"/>
+      <w:r>
+        <w:t>/PostgreSQL qui contrôle l'accès aux données ligne par ligne : un prospect ne voit que ses propres demandes et devis, un administrateur voit l'ensemble du pipeline.</w:t>
       </w:r>
     </w:p>
     <w:p>
@@ -17092,37 +18536,39 @@
         <w:t xml:space="preserve">ROI (Return On Investment) : </w:t>
       </w:r>
       <w:r>
-        <w:t>Retour sur Investissement. Indicateur financier mesurant le gain généré par rapport au coût engagé. Dans le projet : estimé à moins d'un mois de payback grâce aux gains de traitement des leads.</w:t>
+        <w:t xml:space="preserve">Retour sur Investissement. Indicateur financier mesurant le gain généré par rapport au coût engagé. Dans le projet : estimé à moins d'un mois de </w:t>
+      </w:r>
+      <w:proofErr w:type="spellStart"/>
+      <w:r>
+        <w:t>payback</w:t>
+      </w:r>
+      <w:proofErr w:type="spellEnd"/>
+      <w:r>
+        <w:t xml:space="preserve"> grâce aux gains de traitement des leads.</w:t>
       </w:r>
     </w:p>
     <w:p>
       <w:pPr>
         <w:pStyle w:val="Normal1"/>
       </w:pPr>
+      <w:proofErr w:type="spellStart"/>
       <w:r>
         <w:rPr>
           <w:b/>
           <w:bCs/>
         </w:rPr>
-        <w:t xml:space="preserve">Scoring : </w:t>
-      </w:r>
-      <w:r>
-        <w:t>Attribution d'un score numérique à un lead ou une demande selon des critères définis (potentiel CA, urgence, complexité…) pour aider à la priorisation commerciale.</w:t>
-      </w:r>
-    </w:p>
-    <w:p>
-      <w:pPr>
-        <w:pStyle w:val="Normal1"/>
-      </w:pPr>
+        <w:t>Scoring</w:t>
+      </w:r>
+      <w:proofErr w:type="spellEnd"/>
       <w:r>
         <w:rPr>
           <w:b/>
           <w:bCs/>
         </w:rPr>
-        <w:t xml:space="preserve">Sorties structurées : </w:t>
-      </w:r>
-      <w:r>
-        <w:t>Technique qui force la réponse du LLM à respecter un format JSON défini, pour obtenir des données exploitables et typées par le code avant d'appeler calculer_devis().</w:t>
+        <w:t xml:space="preserve"> : </w:t>
+      </w:r>
+      <w:r>
+        <w:t>Attribution d'un score numérique à un lead ou une demande selon des critères définis (potentiel CA, urgence, complexité…) pour aider à la priorisation commerciale.</w:t>
       </w:r>
     </w:p>
     <w:p>
@@ -17134,10 +18580,26 @@
           <w:b/>
           <w:bCs/>
         </w:rPr>
-        <w:t xml:space="preserve">Stack technique : </w:t>
-      </w:r>
-      <w:r>
-        <w:t>Ensemble des outils, langages et services technologiques utilisés pour construire une solution. Dans le projet : Next.js, n8n, Supabase, Resend, Netlify, Gemma 4.</w:t>
+        <w:t xml:space="preserve">Sorties structurées : </w:t>
+      </w:r>
+      <w:r>
+        <w:t xml:space="preserve">Technique qui force la réponse du LLM à respecter un format JSON défini, pour obtenir des données exploitables et typées par le code avant d'appeler </w:t>
+      </w:r>
+      <w:proofErr w:type="spellStart"/>
+      <w:r>
+        <w:t>calculer_</w:t>
+      </w:r>
+      <w:proofErr w:type="gramStart"/>
+      <w:r>
+        <w:t>devis</w:t>
+      </w:r>
+      <w:proofErr w:type="spellEnd"/>
+      <w:r>
+        <w:t>(</w:t>
+      </w:r>
+      <w:proofErr w:type="gramEnd"/>
+      <w:r>
+        <w:t>).</w:t>
       </w:r>
     </w:p>
     <w:p>
@@ -17149,10 +18611,34 @@
           <w:b/>
           <w:bCs/>
         </w:rPr>
-        <w:t xml:space="preserve">Streaming : </w:t>
-      </w:r>
-      <w:r>
-        <w:t>Affichage de la réponse du LLM au fil de sa génération (token par token), pour une expérience utilisateur fluide dans l'interface de chat.</w:t>
+        <w:t xml:space="preserve">Stack technique : </w:t>
+      </w:r>
+      <w:r>
+        <w:t xml:space="preserve">Ensemble des outils, langages et services technologiques utilisés pour construire une solution. Dans le projet : Next.js, n8n, </w:t>
+      </w:r>
+      <w:proofErr w:type="spellStart"/>
+      <w:r>
+        <w:t>Supabase</w:t>
+      </w:r>
+      <w:proofErr w:type="spellEnd"/>
+      <w:r>
+        <w:t xml:space="preserve">, </w:t>
+      </w:r>
+      <w:proofErr w:type="spellStart"/>
+      <w:r>
+        <w:t>Resend</w:t>
+      </w:r>
+      <w:proofErr w:type="spellEnd"/>
+      <w:r>
+        <w:t xml:space="preserve">, </w:t>
+      </w:r>
+      <w:proofErr w:type="spellStart"/>
+      <w:r>
+        <w:t>Netlify</w:t>
+      </w:r>
+      <w:proofErr w:type="spellEnd"/>
+      <w:r>
+        <w:t>, Gemma 4.</w:t>
       </w:r>
     </w:p>
     <w:p>
@@ -17164,10 +18650,26 @@
           <w:b/>
           <w:bCs/>
         </w:rPr>
-        <w:t xml:space="preserve">Température : </w:t>
-      </w:r>
-      <w:r>
-        <w:t>Paramètre du LLM contrôlant l'aléatoire des réponses. Une température basse produit des réponses stables et factuelles (adaptées à l'extraction de paramètres de devis) ; une température haute produit des réponses plus créatives et variées.</w:t>
+        <w:t xml:space="preserve">Streaming : </w:t>
+      </w:r>
+      <w:r>
+        <w:t>Affichage de la réponse du LLM au fil de sa génération (</w:t>
+      </w:r>
+      <w:proofErr w:type="spellStart"/>
+      <w:r>
+        <w:t>token</w:t>
+      </w:r>
+      <w:proofErr w:type="spellEnd"/>
+      <w:r>
+        <w:t xml:space="preserve"> par </w:t>
+      </w:r>
+      <w:proofErr w:type="spellStart"/>
+      <w:r>
+        <w:t>token</w:t>
+      </w:r>
+      <w:proofErr w:type="spellEnd"/>
+      <w:r>
+        <w:t>), pour une expérience utilisateur fluide dans l'interface de chat.</w:t>
       </w:r>
     </w:p>
     <w:p>
@@ -17179,40 +18681,42 @@
           <w:b/>
           <w:bCs/>
         </w:rPr>
-        <w:t xml:space="preserve">Token : </w:t>
-      </w:r>
-      <w:r>
-        <w:t>Unité de texte (environ trois quarts de mot) que le modèle LLM lit et génère. La fenêtre de contexte et le coût d'utilisation du modèle se mesurent en tokens.</w:t>
+        <w:t xml:space="preserve">Température : </w:t>
+      </w:r>
+      <w:r>
+        <w:t>Paramètre du LLM contrôlant l'aléatoire des réponses. Une température basse produit des réponses stables et factuelles (adaptées à l'extraction de paramètres de devis) ; une température haute produit des réponses plus créatives et variées.</w:t>
       </w:r>
     </w:p>
     <w:p>
       <w:pPr>
         <w:pStyle w:val="Normal1"/>
       </w:pPr>
+      <w:proofErr w:type="spellStart"/>
       <w:r>
         <w:rPr>
           <w:b/>
           <w:bCs/>
         </w:rPr>
-        <w:t xml:space="preserve">Tool / Function calling : </w:t>
-      </w:r>
-      <w:r>
-        <w:t>Mécanisme par lequel le LLM déclenche une fonction externe (ex. calculer_devis()) avec des paramètres structurés. C'est le code, non le LLM, qui s'exécute réellement et produit le résultat.</w:t>
-      </w:r>
-    </w:p>
-    <w:p>
-      <w:pPr>
-        <w:pStyle w:val="Normal1"/>
-      </w:pPr>
+        <w:t>Token</w:t>
+      </w:r>
+      <w:proofErr w:type="spellEnd"/>
       <w:r>
         <w:rPr>
           <w:b/>
           <w:bCs/>
         </w:rPr>
-        <w:t xml:space="preserve">TVA (Taxe sur la Valeur Ajoutée) : </w:t>
-      </w:r>
-      <w:r>
-        <w:t>Taxe applicable sur les prestations de services. Dans le moteur de calcul calculer_devis() : TVA à 10 % appliquée en dernière étape, après la marge commerciale.</w:t>
+        <w:t xml:space="preserve"> : </w:t>
+      </w:r>
+      <w:r>
+        <w:t xml:space="preserve">Unité de texte (environ trois quarts de mot) que le modèle LLM lit et génère. La fenêtre de contexte et le coût d'utilisation du modèle se mesurent en </w:t>
+      </w:r>
+      <w:proofErr w:type="spellStart"/>
+      <w:r>
+        <w:t>tokens</w:t>
+      </w:r>
+      <w:proofErr w:type="spellEnd"/>
+      <w:r>
+        <w:t>.</w:t>
       </w:r>
     </w:p>
     <w:p>
@@ -17224,40 +18728,175 @@
           <w:b/>
           <w:bCs/>
         </w:rPr>
-        <w:t xml:space="preserve">UI (User Interface) : </w:t>
-      </w:r>
-      <w:r>
-        <w:t>Interface utilisateur. Désigne la partie visuelle de l'application avec laquelle l'utilisateur interagit directement (landing page, chatbot, dashboard).</w:t>
-      </w:r>
-    </w:p>
-    <w:p>
-      <w:pPr>
-        <w:pStyle w:val="Normal1"/>
-      </w:pPr>
+        <w:t xml:space="preserve">Tool / </w:t>
+      </w:r>
+      <w:proofErr w:type="spellStart"/>
       <w:r>
         <w:rPr>
           <w:b/>
           <w:bCs/>
         </w:rPr>
-        <w:t xml:space="preserve">Webhook : </w:t>
-      </w:r>
-      <w:r>
-        <w:t>URL exposée par un service qui reçoit un événement déclencheur (ex. nouvelle demande depuis la landing page) pour lancer automatiquement un workflow n8n.</w:t>
-      </w:r>
-    </w:p>
-    <w:p>
-      <w:pPr>
-        <w:pStyle w:val="Normal1"/>
-      </w:pPr>
+        <w:t>Function</w:t>
+      </w:r>
+      <w:proofErr w:type="spellEnd"/>
       <w:r>
         <w:rPr>
           <w:b/>
           <w:bCs/>
         </w:rPr>
+        <w:t xml:space="preserve"> </w:t>
+      </w:r>
+      <w:proofErr w:type="spellStart"/>
+      <w:r>
+        <w:rPr>
+          <w:b/>
+          <w:bCs/>
+        </w:rPr>
+        <w:t>calling</w:t>
+      </w:r>
+      <w:proofErr w:type="spellEnd"/>
+      <w:r>
+        <w:rPr>
+          <w:b/>
+          <w:bCs/>
+        </w:rPr>
+        <w:t xml:space="preserve"> : </w:t>
+      </w:r>
+      <w:r>
+        <w:t xml:space="preserve">Mécanisme par lequel le LLM déclenche une fonction externe (ex. </w:t>
+      </w:r>
+      <w:proofErr w:type="spellStart"/>
+      <w:r>
+        <w:t>calculer_</w:t>
+      </w:r>
+      <w:proofErr w:type="gramStart"/>
+      <w:r>
+        <w:t>devis</w:t>
+      </w:r>
+      <w:proofErr w:type="spellEnd"/>
+      <w:r>
+        <w:t>(</w:t>
+      </w:r>
+      <w:proofErr w:type="gramEnd"/>
+      <w:r>
+        <w:t>)) avec des paramètres structurés. C'est le code, non le LLM, qui s'exécute réellement et produit le résultat.</w:t>
+      </w:r>
+    </w:p>
+    <w:p>
+      <w:pPr>
+        <w:pStyle w:val="Normal1"/>
+      </w:pPr>
+      <w:r>
+        <w:rPr>
+          <w:b/>
+          <w:bCs/>
+        </w:rPr>
+        <w:t xml:space="preserve">TVA (Taxe sur la Valeur Ajoutée) : </w:t>
+      </w:r>
+      <w:r>
+        <w:t xml:space="preserve">Taxe applicable sur les prestations de services. Dans le moteur de calcul </w:t>
+      </w:r>
+      <w:proofErr w:type="spellStart"/>
+      <w:r>
+        <w:t>calculer_</w:t>
+      </w:r>
+      <w:proofErr w:type="gramStart"/>
+      <w:r>
+        <w:t>devis</w:t>
+      </w:r>
+      <w:proofErr w:type="spellEnd"/>
+      <w:r>
+        <w:t>(</w:t>
+      </w:r>
+      <w:proofErr w:type="gramEnd"/>
+      <w:r>
+        <w:t>) : TVA à 10 % appliquée en dernière étape, après la marge commerciale.</w:t>
+      </w:r>
+    </w:p>
+    <w:p>
+      <w:pPr>
+        <w:pStyle w:val="Normal1"/>
+      </w:pPr>
+      <w:r>
+        <w:rPr>
+          <w:b/>
+          <w:bCs/>
+        </w:rPr>
+        <w:t xml:space="preserve">UI (User Interface) : </w:t>
+      </w:r>
+      <w:r>
+        <w:t xml:space="preserve">Interface utilisateur. Désigne la partie visuelle de l'application avec laquelle l'utilisateur interagit directement (landing page, </w:t>
+      </w:r>
+      <w:proofErr w:type="spellStart"/>
+      <w:r>
+        <w:t>chatbot</w:t>
+      </w:r>
+      <w:proofErr w:type="spellEnd"/>
+      <w:r>
+        <w:t xml:space="preserve">, </w:t>
+      </w:r>
+      <w:proofErr w:type="spellStart"/>
+      <w:r>
+        <w:t>dashboard</w:t>
+      </w:r>
+      <w:proofErr w:type="spellEnd"/>
+      <w:r>
+        <w:t>).</w:t>
+      </w:r>
+    </w:p>
+    <w:p>
+      <w:pPr>
+        <w:pStyle w:val="Normal1"/>
+      </w:pPr>
+      <w:proofErr w:type="spellStart"/>
+      <w:r>
+        <w:rPr>
+          <w:b/>
+          <w:bCs/>
+        </w:rPr>
+        <w:t>Webhook</w:t>
+      </w:r>
+      <w:proofErr w:type="spellEnd"/>
+      <w:r>
+        <w:rPr>
+          <w:b/>
+          <w:bCs/>
+        </w:rPr>
+        <w:t xml:space="preserve"> : </w:t>
+      </w:r>
+      <w:r>
+        <w:t xml:space="preserve">URL exposée par un service qui reçoit un événement déclencheur (ex. nouvelle demande depuis </w:t>
+      </w:r>
+      <w:proofErr w:type="gramStart"/>
+      <w:r>
+        <w:t>la landing</w:t>
+      </w:r>
+      <w:proofErr w:type="gramEnd"/>
+      <w:r>
+        <w:t xml:space="preserve"> page) pour lancer automatiquement un workflow n8n.</w:t>
+      </w:r>
+    </w:p>
+    <w:p>
+      <w:pPr>
+        <w:pStyle w:val="Normal1"/>
+      </w:pPr>
+      <w:r>
+        <w:rPr>
+          <w:b/>
+          <w:bCs/>
+        </w:rPr>
         <w:t xml:space="preserve">Workflow : </w:t>
       </w:r>
       <w:r>
-        <w:t>Séquence d'étapes automatisées dans n8n (réception de demande, qualification, calcul, génération PDF, email…). Un workflow exécute des étapes ; les décisions sensibles restent encadrées par l'humain.</w:t>
+        <w:t xml:space="preserve">Séquence d'étapes automatisées dans n8n (réception de demande, qualification, calcul, génération PDF, </w:t>
+      </w:r>
+      <w:proofErr w:type="gramStart"/>
+      <w:r>
+        <w:t>email</w:t>
+      </w:r>
+      <w:proofErr w:type="gramEnd"/>
+      <w:r>
+        <w:t>…). Un workflow exécute des étapes ; les décisions sensibles restent encadrées par l'humain.</w:t>
       </w:r>
     </w:p>
     <w:p>
@@ -19596,6 +21235,19 @@
 </file>
 
 <file path=customXml/item2.xml><?xml version="1.0" encoding="utf-8"?>
+<?mso-contentType ?>
+<FormTemplates xmlns="http://schemas.microsoft.com/sharepoint/v3/contenttype/forms">
+  <Display>DocumentLibraryForm</Display>
+  <Edit>DocumentLibraryForm</Edit>
+  <New>DocumentLibraryForm</New>
+</FormTemplates>
+</file>
+
+<file path=customXml/item3.xml><?xml version="1.0" encoding="utf-8"?>
+<b:Sources xmlns:b="http://schemas.openxmlformats.org/officeDocument/2006/bibliography" xmlns="http://schemas.openxmlformats.org/officeDocument/2006/bibliography" SelectedStyle="\APASixthEditionOfficeOnline.xsl" StyleName="APA" Version="6"/>
+</file>
+
+<file path=customXml/item4.xml><?xml version="1.0" encoding="utf-8"?>
 <ct:contentTypeSchema xmlns:ct="http://schemas.microsoft.com/office/2006/metadata/contentType" xmlns:ma="http://schemas.microsoft.com/office/2006/metadata/properties/metaAttributes" ct:_="" ma:_="" ma:contentTypeName="Document" ma:contentTypeID="0x01010008A9442D164A214FB75658819F99AF85" ma:contentTypeVersion="10" ma:contentTypeDescription="Crée un document." ma:contentTypeScope="" ma:versionID="81ed831bb7d06df50a5a3952d23cefd1">
   <xsd:schema xmlns:xsd="http://www.w3.org/2001/XMLSchema" xmlns:xs="http://www.w3.org/2001/XMLSchema" xmlns:p="http://schemas.microsoft.com/office/2006/metadata/properties" xmlns:ns2="e92e7415-81cb-47b8-a844-76566823e5a2" xmlns:ns3="76985e77-3742-43e1-98a7-928e24c9a13a" targetNamespace="http://schemas.microsoft.com/office/2006/metadata/properties" ma:root="true" ma:fieldsID="f124560c73ff02b20ce31e9c632ac72a" ns2:_="" ns3:_="">
     <xsd:import namespace="e92e7415-81cb-47b8-a844-76566823e5a2"/>
@@ -19784,19 +21436,6 @@
 </ct:contentTypeSchema>
 </file>
 
-<file path=customXml/item3.xml><?xml version="1.0" encoding="utf-8"?>
-<b:Sources xmlns:b="http://schemas.openxmlformats.org/officeDocument/2006/bibliography" xmlns="http://schemas.openxmlformats.org/officeDocument/2006/bibliography" SelectedStyle="\APASixthEditionOfficeOnline.xsl" StyleName="APA" Version="6"/>
-</file>
-
-<file path=customXml/item4.xml><?xml version="1.0" encoding="utf-8"?>
-<?mso-contentType ?>
-<FormTemplates xmlns="http://schemas.microsoft.com/sharepoint/v3/contenttype/forms">
-  <Display>DocumentLibraryForm</Display>
-  <Edit>DocumentLibraryForm</Edit>
-  <New>DocumentLibraryForm</New>
-</FormTemplates>
-</file>
-
 <file path=customXml/itemProps1.xml><?xml version="1.0" encoding="utf-8"?>
 <ds:datastoreItem xmlns:ds="http://schemas.openxmlformats.org/officeDocument/2006/customXml" ds:itemID="{A22EAF01-3D16-467F-8DDD-2C461BA30656}">
   <ds:schemaRefs>
@@ -19809,6 +21448,22 @@
 </file>
 
 <file path=customXml/itemProps2.xml><?xml version="1.0" encoding="utf-8"?>
+<ds:datastoreItem xmlns:ds="http://schemas.openxmlformats.org/officeDocument/2006/customXml" ds:itemID="{0DCA1697-5CD9-437D-B9BC-9BFCE3AF93A4}">
+  <ds:schemaRefs>
+    <ds:schemaRef ds:uri="http://schemas.microsoft.com/sharepoint/v3/contenttype/forms"/>
+  </ds:schemaRefs>
+</ds:datastoreItem>
+</file>
+
+<file path=customXml/itemProps3.xml><?xml version="1.0" encoding="utf-8"?>
+<ds:datastoreItem xmlns:ds="http://schemas.openxmlformats.org/officeDocument/2006/customXml" ds:itemID="{319904BF-A50D-470D-BE36-B282CAE1E3EE}">
+  <ds:schemaRefs>
+    <ds:schemaRef ds:uri="http://schemas.openxmlformats.org/officeDocument/2006/bibliography"/>
+  </ds:schemaRefs>
+</ds:datastoreItem>
+</file>
+
+<file path=customXml/itemProps4.xml><?xml version="1.0" encoding="utf-8"?>
 <ds:datastoreItem xmlns:ds="http://schemas.openxmlformats.org/officeDocument/2006/customXml" ds:itemID="{EF67A5E2-9999-42AF-AE03-90AFDB20F4AE}">
   <ds:schemaRefs>
     <ds:schemaRef ds:uri="http://schemas.microsoft.com/office/2006/metadata/contentType"/>
@@ -19825,20 +21480,4 @@
     <ds:schemaRef ds:uri="http://schemas.microsoft.com/internal/obd"/>
   </ds:schemaRefs>
 </ds:datastoreItem>
-</file>
-
-<file path=customXml/itemProps3.xml><?xml version="1.0" encoding="utf-8"?>
-<ds:datastoreItem xmlns:ds="http://schemas.openxmlformats.org/officeDocument/2006/customXml" ds:itemID="{319904BF-A50D-470D-BE36-B282CAE1E3EE}">
-  <ds:schemaRefs>
-    <ds:schemaRef ds:uri="http://schemas.openxmlformats.org/officeDocument/2006/bibliography"/>
-  </ds:schemaRefs>
-</ds:datastoreItem>
-</file>
-
-<file path=customXml/itemProps4.xml><?xml version="1.0" encoding="utf-8"?>
-<ds:datastoreItem xmlns:ds="http://schemas.openxmlformats.org/officeDocument/2006/customXml" ds:itemID="{0DCA1697-5CD9-437D-B9BC-9BFCE3AF93A4}">
-  <ds:schemaRefs>
-    <ds:schemaRef ds:uri="http://schemas.microsoft.com/sharepoint/v3/contenttype/forms"/>
-  </ds:schemaRefs>
-</ds:datastoreItem>
 </file>
</xml_diff>